<commit_message>
Format P05 questionnaire in black Times New Roman 12 and Vancouver; move results before questions
</commit_message>
<xml_diff>
--- a/downloads/Practica_05_Cuestionario_Vallery_Cuayla.docx
+++ b/downloads/Practica_05_Cuestionario_Vallery_Cuayla.docx
@@ -4,33 +4,48 @@
   <w:body>
     <w:p>
       <w:pPr>
+        <w:spacing w:after="160"/>
         <w:jc w:val="center"/>
       </w:pPr>
       <w:r>
         <w:rPr>
           <w:b/>
-          <w:sz w:val="32"/>
+          <w:rFonts w:ascii="Times New Roman" w:hAnsi="Times New Roman" w:eastAsia="Times New Roman" w:cs="Times New Roman"/>
+          <w:sz w:val="24"/>
+          <w:szCs w:val="24"/>
+          <w:color w:val="000000"/>
         </w:rPr>
         <w:t>UNIVERSIDAD NACIONAL DE MOQUEGUA</w:t>
       </w:r>
     </w:p>
     <w:p>
       <w:pPr>
+        <w:spacing w:after="160"/>
         <w:jc w:val="center"/>
       </w:pPr>
       <w:r>
         <w:rPr>
           <w:b/>
+          <w:rFonts w:ascii="Times New Roman" w:hAnsi="Times New Roman" w:eastAsia="Times New Roman" w:cs="Times New Roman"/>
           <w:sz w:val="24"/>
+          <w:szCs w:val="24"/>
+          <w:color w:val="000000"/>
         </w:rPr>
         <w:t>ESCUELA PROFESIONAL DE MEDICINA</w:t>
       </w:r>
     </w:p>
     <w:p>
       <w:pPr>
+        <w:spacing w:after="160"/>
         <w:jc w:val="center"/>
       </w:pPr>
       <w:r>
+        <w:rPr>
+          <w:rFonts w:ascii="Times New Roman" w:hAnsi="Times New Roman" w:eastAsia="Times New Roman" w:cs="Times New Roman"/>
+          <w:sz w:val="24"/>
+          <w:szCs w:val="24"/>
+          <w:color w:val="000000"/>
+        </w:rPr>
         <w:drawing>
           <wp:inline xmlns:a="http://schemas.openxmlformats.org/drawingml/2006/main" xmlns:pic="http://schemas.openxmlformats.org/drawingml/2006/picture">
             <wp:extent cx="1508760" cy="1661546"/>
@@ -67,36 +82,48 @@
     </w:p>
     <w:p>
       <w:pPr>
+        <w:spacing w:after="160"/>
         <w:jc w:val="center"/>
       </w:pPr>
       <w:r>
         <w:rPr>
           <w:b/>
-          <w:sz w:val="28"/>
+          <w:rFonts w:ascii="Times New Roman" w:hAnsi="Times New Roman" w:eastAsia="Times New Roman" w:cs="Times New Roman"/>
+          <w:sz w:val="24"/>
+          <w:szCs w:val="24"/>
+          <w:color w:val="000000"/>
         </w:rPr>
         <w:t>BIOQUÍMICA MÉDICA</w:t>
       </w:r>
     </w:p>
     <w:p>
       <w:pPr>
+        <w:spacing w:after="160"/>
         <w:jc w:val="center"/>
       </w:pPr>
       <w:r>
         <w:rPr>
           <w:b/>
-          <w:sz w:val="30"/>
+          <w:rFonts w:ascii="Times New Roman" w:hAnsi="Times New Roman" w:eastAsia="Times New Roman" w:cs="Times New Roman"/>
+          <w:sz w:val="24"/>
+          <w:szCs w:val="24"/>
+          <w:color w:val="000000"/>
         </w:rPr>
         <w:t>PRÁCTICA N.° 05</w:t>
       </w:r>
     </w:p>
     <w:p>
       <w:pPr>
+        <w:spacing w:after="160"/>
         <w:jc w:val="center"/>
       </w:pPr>
       <w:r>
         <w:rPr>
           <w:b/>
-          <w:sz w:val="46"/>
+          <w:rFonts w:ascii="Times New Roman" w:hAnsi="Times New Roman" w:eastAsia="Times New Roman" w:cs="Times New Roman"/>
+          <w:sz w:val="24"/>
+          <w:szCs w:val="24"/>
+          <w:color w:val="000000"/>
         </w:rPr>
         <w:t>Metabolismo de la glucosa:</w:t>
         <w:br/>
@@ -105,492 +132,186 @@
     </w:p>
     <w:p>
       <w:pPr>
+        <w:spacing w:after="160"/>
         <w:jc w:val="center"/>
       </w:pPr>
       <w:r>
         <w:rPr>
           <w:b w:val="0"/>
+          <w:rFonts w:ascii="Times New Roman" w:hAnsi="Times New Roman" w:eastAsia="Times New Roman" w:cs="Times New Roman"/>
           <w:sz w:val="24"/>
+          <w:szCs w:val="24"/>
+          <w:color w:val="000000"/>
         </w:rPr>
         <w:t>Cuestionario e informe digital de resultados</w:t>
       </w:r>
     </w:p>
     <w:p>
       <w:pPr>
+        <w:spacing w:after="160"/>
         <w:jc w:val="center"/>
       </w:pPr>
       <w:r>
         <w:rPr>
           <w:b/>
-          <w:sz w:val="20"/>
+          <w:rFonts w:ascii="Times New Roman" w:hAnsi="Times New Roman" w:eastAsia="Times New Roman" w:cs="Times New Roman"/>
+          <w:sz w:val="24"/>
+          <w:szCs w:val="24"/>
+          <w:color w:val="000000"/>
         </w:rPr>
         <w:t>Docente</w:t>
       </w:r>
     </w:p>
     <w:p>
       <w:pPr>
+        <w:spacing w:after="160"/>
         <w:jc w:val="center"/>
       </w:pPr>
       <w:r>
         <w:rPr>
           <w:b w:val="0"/>
+          <w:rFonts w:ascii="Times New Roman" w:hAnsi="Times New Roman" w:eastAsia="Times New Roman" w:cs="Times New Roman"/>
           <w:sz w:val="24"/>
+          <w:szCs w:val="24"/>
+          <w:color w:val="000000"/>
         </w:rPr>
         <w:t>M.C. Clinthon Oliver Ugarte Espinoza</w:t>
       </w:r>
     </w:p>
     <w:p>
       <w:pPr>
+        <w:spacing w:after="160"/>
         <w:jc w:val="center"/>
       </w:pPr>
       <w:r>
         <w:rPr>
           <w:b/>
-          <w:sz w:val="20"/>
+          <w:rFonts w:ascii="Times New Roman" w:hAnsi="Times New Roman" w:eastAsia="Times New Roman" w:cs="Times New Roman"/>
+          <w:sz w:val="24"/>
+          <w:szCs w:val="24"/>
+          <w:color w:val="000000"/>
         </w:rPr>
         <w:t>Jefa de prácticas</w:t>
       </w:r>
     </w:p>
     <w:p>
       <w:pPr>
+        <w:spacing w:after="160"/>
         <w:jc w:val="center"/>
       </w:pPr>
       <w:r>
         <w:rPr>
           <w:b w:val="0"/>
+          <w:rFonts w:ascii="Times New Roman" w:hAnsi="Times New Roman" w:eastAsia="Times New Roman" w:cs="Times New Roman"/>
           <w:sz w:val="24"/>
+          <w:szCs w:val="24"/>
+          <w:color w:val="000000"/>
         </w:rPr>
         <w:t>Lic. Judith Melania Coaquira Quispe</w:t>
       </w:r>
     </w:p>
     <w:p>
       <w:pPr>
+        <w:spacing w:after="160"/>
         <w:jc w:val="center"/>
       </w:pPr>
       <w:r>
         <w:rPr>
           <w:b/>
-          <w:sz w:val="20"/>
+          <w:rFonts w:ascii="Times New Roman" w:hAnsi="Times New Roman" w:eastAsia="Times New Roman" w:cs="Times New Roman"/>
+          <w:sz w:val="24"/>
+          <w:szCs w:val="24"/>
+          <w:color w:val="000000"/>
         </w:rPr>
         <w:t>Estudiante</w:t>
       </w:r>
     </w:p>
     <w:p>
       <w:pPr>
+        <w:spacing w:after="160"/>
         <w:jc w:val="center"/>
       </w:pPr>
       <w:r>
         <w:rPr>
           <w:b w:val="0"/>
+          <w:rFonts w:ascii="Times New Roman" w:hAnsi="Times New Roman" w:eastAsia="Times New Roman" w:cs="Times New Roman"/>
           <w:sz w:val="24"/>
+          <w:szCs w:val="24"/>
+          <w:color w:val="000000"/>
         </w:rPr>
         <w:t>Vallery Y. Cuayla Platero · Grupo A</w:t>
       </w:r>
     </w:p>
     <w:p>
       <w:pPr>
+        <w:spacing w:after="160"/>
         <w:jc w:val="center"/>
       </w:pPr>
       <w:r>
         <w:rPr>
           <w:b w:val="0"/>
-          <w:sz w:val="22"/>
+          <w:rFonts w:ascii="Times New Roman" w:hAnsi="Times New Roman" w:eastAsia="Times New Roman" w:cs="Times New Roman"/>
+          <w:sz w:val="24"/>
+          <w:szCs w:val="24"/>
+          <w:color w:val="000000"/>
         </w:rPr>
         <w:t>Moquegua, Perú · 2026</w:t>
       </w:r>
     </w:p>
     <w:p>
+      <w:pPr>
+        <w:spacing w:after="160"/>
+      </w:pPr>
       <w:r>
+        <w:rPr>
+          <w:rFonts w:ascii="Times New Roman" w:hAnsi="Times New Roman" w:eastAsia="Times New Roman" w:cs="Times New Roman"/>
+          <w:sz w:val="24"/>
+          <w:szCs w:val="24"/>
+          <w:color w:val="000000"/>
+        </w:rPr>
         <w:br w:type="page"/>
       </w:r>
     </w:p>
     <w:p>
       <w:pPr>
         <w:pStyle w:val="Heading1"/>
+        <w:spacing w:after="160"/>
       </w:pPr>
       <w:r>
-        <w:t>Cuestionario</w:t>
+        <w:rPr>
+          <w:rFonts w:ascii="Times New Roman" w:hAnsi="Times New Roman" w:eastAsia="Times New Roman" w:cs="Times New Roman"/>
+          <w:sz w:val="24"/>
+          <w:szCs w:val="24"/>
+          <w:color w:val="000000"/>
+        </w:rPr>
+        <w:t>Resultados</w:t>
       </w:r>
     </w:p>
     <w:p>
       <w:pPr>
-        <w:pStyle w:val="Heading2"/>
+        <w:spacing w:after="160"/>
       </w:pPr>
       <w:r>
-        <w:t>1. ¿Cuáles son las instrucciones específicas que se le deben dar al paciente sobre el ayuno, la actividad física y la medicación antes de realizar una TTG?</w:t>
-      </w:r>
-    </w:p>
-    <w:p>
-      <w:r>
-        <w:t>Mantener la alimentación y actividad habituales durante los tres días previos, con al menos 150 g diarios de carbohidratos; evitar restricciones de carbohidratos y ejercicio intenso inusual. Acudir por la mañana tras un ayuno de al menos 8 horas, tomando únicamente agua. Durante la prueba, permanecer sentado y no comer, fumar ni realizar ejercicio. La carga del adulto no embarazado equivale a 75 g de glucosa anhidra disuelta en agua [1–3].</w:t>
-      </w:r>
-    </w:p>
-    <w:p>
-      <w:r>
-        <w:t>Informar todos los medicamentos y suplementos. El profesional debe revisar los que modifican la glucemia, como glucocorticoides o fármacos hipoglucemiantes, y definir si corresponde ajustar su horario o posponer el examen. El paciente no debe suspenderlos por cuenta propia. Una enfermedad aguda o una preparación inadecuada deben comunicarse antes de iniciar la prueba [3].</w:t>
+        <w:rPr>
+          <w:rFonts w:ascii="Times New Roman" w:hAnsi="Times New Roman" w:eastAsia="Times New Roman" w:cs="Times New Roman"/>
+          <w:sz w:val="24"/>
+          <w:szCs w:val="24"/>
+          <w:color w:val="000000"/>
+        </w:rPr>
+        <w:t>Tablas, curvas individuales y grupales, discusión bioquímica, conclusiones y evidencia fotográfica de los dos experimentos.</w:t>
       </w:r>
     </w:p>
     <w:p>
       <w:pPr>
-        <w:pStyle w:val="Heading2"/>
+        <w:spacing w:after="160"/>
       </w:pPr>
-      <w:r>
-        <w:t>2. En una TTG de 2 horas con 75 g de glucosa para un adulto no embarazado, ¿cuáles son los valores de glucosa plasmática en ayunas y a las 2 horas que definen un resultado normal, prediabetes y diabetes?</w:t>
-      </w:r>
-    </w:p>
-    <w:tbl>
-      <w:tblPr>
-        <w:tblStyle w:val="LightShading-Accent1"/>
-        <w:tblW w:type="auto" w:w="0"/>
-        <w:tblLook w:firstColumn="1" w:firstRow="1" w:lastColumn="0" w:lastRow="0" w:noHBand="0" w:noVBand="1" w:val="04A0"/>
-      </w:tblPr>
-      <w:tblGrid>
-        <w:gridCol w:w="3099"/>
-        <w:gridCol w:w="3099"/>
-        <w:gridCol w:w="3099"/>
-      </w:tblGrid>
-      <w:tr>
-        <w:tc>
-          <w:tcPr>
-            <w:tcW w:type="dxa" w:w="3099"/>
-          </w:tcPr>
-          <w:p>
-            <w:r>
-              <w:t>Categoría</w:t>
-            </w:r>
-          </w:p>
-        </w:tc>
-        <w:tc>
-          <w:tcPr>
-            <w:tcW w:type="dxa" w:w="3099"/>
-          </w:tcPr>
-          <w:p>
-            <w:r>
-              <w:t>Ayunas (mg/dL)</w:t>
-            </w:r>
-          </w:p>
-        </w:tc>
-        <w:tc>
-          <w:tcPr>
-            <w:tcW w:type="dxa" w:w="3099"/>
-          </w:tcPr>
-          <w:p>
-            <w:r>
-              <w:t>2 horas (mg/dL)</w:t>
-            </w:r>
-          </w:p>
-        </w:tc>
-      </w:tr>
-      <w:tr>
-        <w:tc>
-          <w:tcPr>
-            <w:tcW w:type="dxa" w:w="3099"/>
-          </w:tcPr>
-          <w:p>
-            <w:r>
-              <w:t>Normal*</w:t>
-            </w:r>
-          </w:p>
-        </w:tc>
-        <w:tc>
-          <w:tcPr>
-            <w:tcW w:type="dxa" w:w="3099"/>
-          </w:tcPr>
-          <w:p>
-            <w:r>
-              <w:t>&lt;100</w:t>
-            </w:r>
-          </w:p>
-        </w:tc>
-        <w:tc>
-          <w:tcPr>
-            <w:tcW w:type="dxa" w:w="3099"/>
-          </w:tcPr>
-          <w:p>
-            <w:r>
-              <w:t>&lt;140</w:t>
-            </w:r>
-          </w:p>
-        </w:tc>
-      </w:tr>
-      <w:tr>
-        <w:tc>
-          <w:tcPr>
-            <w:tcW w:type="dxa" w:w="3099"/>
-          </w:tcPr>
-          <w:p>
-            <w:r>
-              <w:t>Prediabetes</w:t>
-            </w:r>
-          </w:p>
-        </w:tc>
-        <w:tc>
-          <w:tcPr>
-            <w:tcW w:type="dxa" w:w="3099"/>
-          </w:tcPr>
-          <w:p>
-            <w:r>
-              <w:t>100–125</w:t>
-            </w:r>
-          </w:p>
-        </w:tc>
-        <w:tc>
-          <w:tcPr>
-            <w:tcW w:type="dxa" w:w="3099"/>
-          </w:tcPr>
-          <w:p>
-            <w:r>
-              <w:t>140–199</w:t>
-            </w:r>
-          </w:p>
-        </w:tc>
-      </w:tr>
-      <w:tr>
-        <w:tc>
-          <w:tcPr>
-            <w:tcW w:type="dxa" w:w="3099"/>
-          </w:tcPr>
-          <w:p>
-            <w:r>
-              <w:t>Diabetes</w:t>
-            </w:r>
-          </w:p>
-        </w:tc>
-        <w:tc>
-          <w:tcPr>
-            <w:tcW w:type="dxa" w:w="3099"/>
-          </w:tcPr>
-          <w:p>
-            <w:r>
-              <w:t>≥126</w:t>
-            </w:r>
-          </w:p>
-        </w:tc>
-        <w:tc>
-          <w:tcPr>
-            <w:tcW w:type="dxa" w:w="3099"/>
-          </w:tcPr>
-          <w:p>
-            <w:r>
-              <w:t>≥200</w:t>
-            </w:r>
-          </w:p>
-        </w:tc>
-      </w:tr>
-    </w:tbl>
-    <w:p>
-      <w:r>
-        <w:t>*La categoría normal en esta tabla se refiere a los límites superiores para detectar hiperglucemia; no clasifica valores bajos. Criterios ADA para plasma venoso y adultos no embarazados [1,2].</w:t>
-      </w:r>
-    </w:p>
-    <w:p>
-      <w:r>
-        <w:t>La glucemia alterada en ayunas y la intolerancia a la glucosa pueden aparecer por separado; no es necesario que ambos valores estén alterados. Sin hiperglucemia inequívoca, el diagnóstico de diabetes requiere confirmación. Las lecturas capilares de esta práctica y el horario final aproximado no equivalen a una PTOG diagnóstica de laboratorio [1,2].</w:t>
-      </w:r>
-    </w:p>
-    <w:p>
-      <w:r>
-        <w:br w:type="page"/>
-      </w:r>
-    </w:p>
-    <w:p>
-      <w:pPr>
-        <w:pStyle w:val="Heading1"/>
-      </w:pPr>
-      <w:r>
-        <w:t>Cuestionario · continuación</w:t>
-      </w:r>
-    </w:p>
-    <w:p>
-      <w:pPr>
-        <w:pStyle w:val="Heading2"/>
-      </w:pPr>
-      <w:r>
-        <w:t>3. Mencione dos indicaciones principales por las cuales se solicita una prueba de tolerancia a la glucosa, y explique en qué contexto es especialmente útil.</w:t>
-      </w:r>
-    </w:p>
-    <w:p>
-      <w:r>
-        <w:t>Primera: esclarecer una sospecha de alteración del metabolismo de la glucosa cuando la glucemia en ayunas o la HbA1c son limítrofes o discordantes. La medición posterior a la carga puede detectar intolerancia a la glucosa que no se evidencia en ayunas [1,3].</w:t>
-      </w:r>
-    </w:p>
-    <w:p>
-      <w:r>
-        <w:t>Segunda: evaluar a personas con riesgo elevado de diabetes tipo 2, por ejemplo, con sobrepeso u obesidad junto con antecedentes familiares u otros factores de riesgo, cuando la evaluación inicial no resuelve la sospecha. Resulta útil para identificar alteraciones poscarga y orientar el seguimiento. La selección de la prueba depende de la evaluación clínica; no todos los pacientes necesitan una PTOG [1,2].</w:t>
-      </w:r>
-    </w:p>
-    <w:p>
-      <w:pPr>
-        <w:pStyle w:val="Heading2"/>
-      </w:pPr>
-      <w:r>
-        <w:t>4. Antes de someter a un paciente con diabetes a un test de ejercicio modificado, ¿en qué situaciones clínicas estaría formalmente contraindicado o requeriría una evaluación cardiovascular previa exhaustiva?</w:t>
-      </w:r>
-    </w:p>
-    <w:p>
-      <w:r>
-        <w:t>Debe posponerse ante hipoglucemia no corregida, cetoacidosis o hiperglucemia acompañada de cetosis significativa. Ante enfermedad cardiovascular inestable —como angina inestable, insuficiencia cardíaca descompensada o arritmias con repercusión clínica— no se debe iniciar una prueba docente de ejercicio; corresponde estabilización y valoración médica [4].</w:t>
-      </w:r>
-    </w:p>
-    <w:p>
-      <w:r>
-        <w:t>Dolor torácico, disnea desproporcionada, síncope, cardiopatía conocida, neuropatía autonómica o la intención de realizar actividad intensa justifican una evaluación individual previa. El profesional decide si requiere electrocardiograma, prueba de esfuerzo supervisada u otros estudios. Tener diabetes, por sí solo, no obliga a un estudio cardiovascular exhaustivo antes de actividad ligera o moderada en una persona asintomática [4].</w:t>
-      </w:r>
-    </w:p>
-    <w:p>
-      <w:r>
-        <w:t>Además, la retinopatía proliferativa inestable exige evitar esfuerzos intensos; las úlceras activas del pie requieren modificar las actividades con carga. Deben revisarse medicación, glucemia, hidratación y capacidad funcional [4].</w:t>
-      </w:r>
-    </w:p>
-    <w:p>
-      <w:r>
-        <w:br w:type="page"/>
-      </w:r>
-    </w:p>
-    <w:p>
-      <w:pPr>
-        <w:pStyle w:val="Heading1"/>
-      </w:pPr>
-      <w:r>
-        <w:t>Bibliografía</w:t>
-      </w:r>
-    </w:p>
-    <w:p>
-      <w:pPr>
-        <w:spacing w:after="80"/>
-      </w:pPr>
-      <w:r>
-        <w:rPr>
-          <w:sz w:val="18"/>
-        </w:rPr>
-        <w:t>1. American Diabetes Association Professional Practice Committee. Diagnosis and Classification of Diabetes: Standards of Care in Diabetes—2026. Diabetes Care. 2026;49(Suppl 1):S27–S49.</w:t>
-      </w:r>
-    </w:p>
-    <w:p>
-      <w:pPr>
-        <w:spacing w:after="140"/>
-      </w:pPr>
-      <w:hyperlink r:id="rId10">
-        <w:r>
-          <w:rPr>
-            <w:color w:val="163B8C"/>
-          </w:rPr>
-          <w:t>https://doi.org/10.2337/dc26-S002</w:t>
-        </w:r>
-      </w:hyperlink>
-    </w:p>
-    <w:p>
-      <w:pPr>
-        <w:spacing w:after="80"/>
-      </w:pPr>
-      <w:r>
-        <w:rPr>
-          <w:sz w:val="18"/>
-        </w:rPr>
-        <w:t>2. National Institute of Diabetes and Digestive and Kidney Diseases. Diabetes Tests &amp; Diagnosis.</w:t>
-      </w:r>
-    </w:p>
-    <w:p>
-      <w:pPr>
-        <w:spacing w:after="140"/>
-      </w:pPr>
-      <w:hyperlink r:id="rId11">
-        <w:r>
-          <w:rPr>
-            <w:color w:val="163B8C"/>
-          </w:rPr>
-          <w:t>https://www.niddk.nih.gov/health-information/diabetes/overview/tests-diagnosis</w:t>
-        </w:r>
-      </w:hyperlink>
-    </w:p>
-    <w:p>
-      <w:pPr>
-        <w:spacing w:after="80"/>
-      </w:pPr>
-      <w:r>
-        <w:rPr>
-          <w:sz w:val="18"/>
-        </w:rPr>
-        <w:t>3. Phillips PJ. Oral glucose tolerance testing. Australian Family Physician. 2012;41(6):391–393.</w:t>
-      </w:r>
-    </w:p>
-    <w:p>
-      <w:pPr>
-        <w:spacing w:after="140"/>
-      </w:pPr>
-      <w:hyperlink r:id="rId12">
-        <w:r>
-          <w:rPr>
-            <w:color w:val="163B8C"/>
-          </w:rPr>
-          <w:t>https://www.racgp.org.au/afp/2012/june/oral-glucose-tolerance-testing</w:t>
-        </w:r>
-      </w:hyperlink>
-    </w:p>
-    <w:p>
-      <w:pPr>
-        <w:spacing w:after="80"/>
-      </w:pPr>
-      <w:r>
-        <w:rPr>
-          <w:sz w:val="18"/>
-        </w:rPr>
-        <w:t>4. Colberg SR, et al. Physical Activity/Exercise and Diabetes: A Position Statement of the American Diabetes Association. Diabetes Care. 2016;39(11):2065–2079.</w:t>
-      </w:r>
-    </w:p>
-    <w:p>
-      <w:pPr>
-        <w:spacing w:after="140"/>
-      </w:pPr>
-      <w:hyperlink r:id="rId13">
-        <w:r>
-          <w:rPr>
-            <w:color w:val="163B8C"/>
-          </w:rPr>
-          <w:t>https://doi.org/10.2337/dc16-1728</w:t>
-        </w:r>
-      </w:hyperlink>
-    </w:p>
-    <w:p>
-      <w:pPr>
-        <w:spacing w:after="80"/>
-      </w:pPr>
-      <w:r>
-        <w:rPr>
-          <w:sz w:val="18"/>
-        </w:rPr>
-        <w:t>5. Rodwell VW, et al. Harper. Bioquímica ilustrada. 31.ª ed. McGraw-Hill; 2019. Cap. 19: Gluconeogénesis y el control de la glucosa en sangre.</w:t>
-      </w:r>
-    </w:p>
-    <w:p>
-      <w:pPr>
-        <w:spacing w:after="80"/>
-      </w:pPr>
-      <w:r>
-        <w:rPr>
-          <w:sz w:val="18"/>
-        </w:rPr>
-        <w:t>6. Universidad Nacional de Moquegua. Guía de prácticas de Bioquímica Médica: Metabolismo de la glucosa, su relación con la diabetes. Guía rotulada N.° 04, pp. 23–28; material de clase PRACT 5 REAL.</w:t>
-      </w:r>
-    </w:p>
-    <w:p>
-      <w:pPr>
-        <w:pStyle w:val="Heading1"/>
-      </w:pPr>
-      <w:r>
-        <w:t>Resultados de la práctica · acceso digital</w:t>
-      </w:r>
-    </w:p>
-    <w:p>
-      <w:r>
-        <w:t>Tablas, curvas individuales y grupales, discusión bioquímica, conclusiones y evidencia fotográfica de los dos experimentos.</w:t>
-      </w:r>
-    </w:p>
-    <w:p>
       <w:hyperlink r:id="rId14">
         <w:r>
           <w:rPr>
-            <w:color w:val="163B8C"/>
+            <w:rFonts w:ascii="Times New Roman" w:hAnsi="Times New Roman" w:eastAsia="Times New Roman" w:cs="Times New Roman"/>
+            <w:sz w:val="24"/>
+            <w:szCs w:val="24"/>
+            <w:color w:val="000000"/>
           </w:rPr>
           <w:t>Abrir práctica 05 en Bioquímica LabMed</w:t>
         </w:r>
@@ -598,9 +319,16 @@
     </w:p>
     <w:p>
       <w:pPr>
+        <w:spacing w:after="160"/>
         <w:jc w:val="center"/>
       </w:pPr>
       <w:r>
+        <w:rPr>
+          <w:rFonts w:ascii="Times New Roman" w:hAnsi="Times New Roman" w:eastAsia="Times New Roman" w:cs="Times New Roman"/>
+          <w:sz w:val="24"/>
+          <w:szCs w:val="24"/>
+          <w:color w:val="000000"/>
+        </w:rPr>
         <w:drawing>
           <wp:inline xmlns:a="http://schemas.openxmlformats.org/drawingml/2006/main" xmlns:pic="http://schemas.openxmlformats.org/drawingml/2006/picture">
             <wp:extent cx="1554480" cy="1554480"/>
@@ -637,14 +365,559 @@
     </w:p>
     <w:p>
       <w:pPr>
+        <w:spacing w:after="160"/>
         <w:jc w:val="center"/>
       </w:pPr>
       <w:r>
         <w:rPr>
           <w:b w:val="0"/>
-          <w:sz w:val="18"/>
+          <w:rFonts w:ascii="Times New Roman" w:hAnsi="Times New Roman" w:eastAsia="Times New Roman" w:cs="Times New Roman"/>
+          <w:sz w:val="24"/>
+          <w:szCs w:val="24"/>
+          <w:color w:val="000000"/>
         </w:rPr>
         <w:t>https://yasmin-hash1324.github.io/bioquimica-labmed/#p05</w:t>
+      </w:r>
+    </w:p>
+    <w:p>
+      <w:pPr>
+        <w:spacing w:after="160"/>
+      </w:pPr>
+      <w:r>
+        <w:rPr>
+          <w:rFonts w:ascii="Times New Roman" w:hAnsi="Times New Roman" w:eastAsia="Times New Roman" w:cs="Times New Roman"/>
+          <w:sz w:val="24"/>
+          <w:szCs w:val="24"/>
+          <w:color w:val="000000"/>
+        </w:rPr>
+        <w:br w:type="page"/>
+      </w:r>
+    </w:p>
+    <w:p>
+      <w:pPr>
+        <w:pStyle w:val="Heading1"/>
+        <w:spacing w:after="160"/>
+      </w:pPr>
+      <w:r>
+        <w:rPr>
+          <w:rFonts w:ascii="Times New Roman" w:hAnsi="Times New Roman" w:eastAsia="Times New Roman" w:cs="Times New Roman"/>
+          <w:sz w:val="24"/>
+          <w:szCs w:val="24"/>
+          <w:color w:val="000000"/>
+        </w:rPr>
+        <w:t>Cuestionario</w:t>
+      </w:r>
+    </w:p>
+    <w:p>
+      <w:pPr>
+        <w:pStyle w:val="Heading2"/>
+        <w:spacing w:after="160"/>
+      </w:pPr>
+      <w:r>
+        <w:rPr>
+          <w:rFonts w:ascii="Times New Roman" w:hAnsi="Times New Roman" w:eastAsia="Times New Roman" w:cs="Times New Roman"/>
+          <w:sz w:val="24"/>
+          <w:szCs w:val="24"/>
+          <w:color w:val="000000"/>
+        </w:rPr>
+        <w:t>1. ¿Cuáles son las instrucciones específicas que se le deben dar al paciente sobre el ayuno, la actividad física y la medicación antes de realizar una TTG?</w:t>
+      </w:r>
+    </w:p>
+    <w:p>
+      <w:pPr>
+        <w:spacing w:after="160"/>
+      </w:pPr>
+      <w:r>
+        <w:rPr>
+          <w:rFonts w:ascii="Times New Roman" w:hAnsi="Times New Roman" w:eastAsia="Times New Roman" w:cs="Times New Roman"/>
+          <w:sz w:val="24"/>
+          <w:szCs w:val="24"/>
+          <w:color w:val="000000"/>
+        </w:rPr>
+        <w:t>Mantener la alimentación y actividad habituales durante los tres días previos, con al menos 150 g diarios de carbohidratos; evitar restricciones de carbohidratos y ejercicio intenso inusual. Acudir por la mañana tras un ayuno de al menos 8 horas, tomando únicamente agua. Durante la prueba, permanecer sentado y no comer, fumar ni realizar ejercicio. La carga del adulto no embarazado equivale a 75 g de glucosa anhidra disuelta en agua [1–3].</w:t>
+      </w:r>
+    </w:p>
+    <w:p>
+      <w:pPr>
+        <w:spacing w:after="160"/>
+      </w:pPr>
+      <w:r>
+        <w:rPr>
+          <w:rFonts w:ascii="Times New Roman" w:hAnsi="Times New Roman" w:eastAsia="Times New Roman" w:cs="Times New Roman"/>
+          <w:sz w:val="24"/>
+          <w:szCs w:val="24"/>
+          <w:color w:val="000000"/>
+        </w:rPr>
+        <w:t>Informar todos los medicamentos y suplementos. El profesional debe revisar los que modifican la glucemia, como glucocorticoides o fármacos hipoglucemiantes, y definir si corresponde ajustar su horario o posponer el examen. El paciente no debe suspenderlos por cuenta propia. Una enfermedad aguda o una preparación inadecuada deben comunicarse antes de iniciar la prueba [3].</w:t>
+      </w:r>
+    </w:p>
+    <w:p>
+      <w:pPr>
+        <w:pStyle w:val="Heading2"/>
+        <w:spacing w:after="160"/>
+      </w:pPr>
+      <w:r>
+        <w:rPr>
+          <w:rFonts w:ascii="Times New Roman" w:hAnsi="Times New Roman" w:eastAsia="Times New Roman" w:cs="Times New Roman"/>
+          <w:sz w:val="24"/>
+          <w:szCs w:val="24"/>
+          <w:color w:val="000000"/>
+        </w:rPr>
+        <w:t>2. En una TTG de 2 horas con 75 g de glucosa para un adulto no embarazado, ¿cuáles son los valores de glucosa plasmática en ayunas y a las 2 horas que definen un resultado normal, prediabetes y diabetes?</w:t>
+      </w:r>
+    </w:p>
+    <w:tbl>
+      <w:tblPr>
+        <w:tblStyle w:val="TableGrid"/>
+        <w:tblW w:type="auto" w:w="0"/>
+        <w:tblLook w:firstColumn="1" w:firstRow="1" w:lastColumn="0" w:lastRow="0" w:noHBand="0" w:noVBand="1" w:val="04A0"/>
+      </w:tblPr>
+      <w:tblGrid>
+        <w:gridCol w:w="3099"/>
+        <w:gridCol w:w="3099"/>
+        <w:gridCol w:w="3099"/>
+      </w:tblGrid>
+      <w:tr>
+        <w:tc>
+          <w:tcPr>
+            <w:tcW w:type="dxa" w:w="3099"/>
+          </w:tcPr>
+          <w:p>
+            <w:r>
+              <w:rPr>
+                <w:rFonts w:ascii="Times New Roman" w:hAnsi="Times New Roman" w:eastAsia="Times New Roman" w:cs="Times New Roman"/>
+                <w:sz w:val="24"/>
+                <w:szCs w:val="24"/>
+                <w:color w:val="000000"/>
+              </w:rPr>
+              <w:t>Categoría</w:t>
+            </w:r>
+          </w:p>
+        </w:tc>
+        <w:tc>
+          <w:tcPr>
+            <w:tcW w:type="dxa" w:w="3099"/>
+          </w:tcPr>
+          <w:p>
+            <w:r>
+              <w:rPr>
+                <w:rFonts w:ascii="Times New Roman" w:hAnsi="Times New Roman" w:eastAsia="Times New Roman" w:cs="Times New Roman"/>
+                <w:sz w:val="24"/>
+                <w:szCs w:val="24"/>
+                <w:color w:val="000000"/>
+              </w:rPr>
+              <w:t>Ayunas (mg/dL)</w:t>
+            </w:r>
+          </w:p>
+        </w:tc>
+        <w:tc>
+          <w:tcPr>
+            <w:tcW w:type="dxa" w:w="3099"/>
+          </w:tcPr>
+          <w:p>
+            <w:r>
+              <w:rPr>
+                <w:rFonts w:ascii="Times New Roman" w:hAnsi="Times New Roman" w:eastAsia="Times New Roman" w:cs="Times New Roman"/>
+                <w:sz w:val="24"/>
+                <w:szCs w:val="24"/>
+                <w:color w:val="000000"/>
+              </w:rPr>
+              <w:t>2 horas (mg/dL)</w:t>
+            </w:r>
+          </w:p>
+        </w:tc>
+      </w:tr>
+      <w:tr>
+        <w:tc>
+          <w:tcPr>
+            <w:tcW w:type="dxa" w:w="3099"/>
+          </w:tcPr>
+          <w:p>
+            <w:r>
+              <w:rPr>
+                <w:rFonts w:ascii="Times New Roman" w:hAnsi="Times New Roman" w:eastAsia="Times New Roman" w:cs="Times New Roman"/>
+                <w:sz w:val="24"/>
+                <w:szCs w:val="24"/>
+                <w:color w:val="000000"/>
+              </w:rPr>
+              <w:t>Normal*</w:t>
+            </w:r>
+          </w:p>
+        </w:tc>
+        <w:tc>
+          <w:tcPr>
+            <w:tcW w:type="dxa" w:w="3099"/>
+          </w:tcPr>
+          <w:p>
+            <w:r>
+              <w:rPr>
+                <w:rFonts w:ascii="Times New Roman" w:hAnsi="Times New Roman" w:eastAsia="Times New Roman" w:cs="Times New Roman"/>
+                <w:sz w:val="24"/>
+                <w:szCs w:val="24"/>
+                <w:color w:val="000000"/>
+              </w:rPr>
+              <w:t>&lt;100</w:t>
+            </w:r>
+          </w:p>
+        </w:tc>
+        <w:tc>
+          <w:tcPr>
+            <w:tcW w:type="dxa" w:w="3099"/>
+          </w:tcPr>
+          <w:p>
+            <w:r>
+              <w:rPr>
+                <w:rFonts w:ascii="Times New Roman" w:hAnsi="Times New Roman" w:eastAsia="Times New Roman" w:cs="Times New Roman"/>
+                <w:sz w:val="24"/>
+                <w:szCs w:val="24"/>
+                <w:color w:val="000000"/>
+              </w:rPr>
+              <w:t>&lt;140</w:t>
+            </w:r>
+          </w:p>
+        </w:tc>
+      </w:tr>
+      <w:tr>
+        <w:tc>
+          <w:tcPr>
+            <w:tcW w:type="dxa" w:w="3099"/>
+          </w:tcPr>
+          <w:p>
+            <w:r>
+              <w:rPr>
+                <w:rFonts w:ascii="Times New Roman" w:hAnsi="Times New Roman" w:eastAsia="Times New Roman" w:cs="Times New Roman"/>
+                <w:sz w:val="24"/>
+                <w:szCs w:val="24"/>
+                <w:color w:val="000000"/>
+              </w:rPr>
+              <w:t>Prediabetes</w:t>
+            </w:r>
+          </w:p>
+        </w:tc>
+        <w:tc>
+          <w:tcPr>
+            <w:tcW w:type="dxa" w:w="3099"/>
+          </w:tcPr>
+          <w:p>
+            <w:r>
+              <w:rPr>
+                <w:rFonts w:ascii="Times New Roman" w:hAnsi="Times New Roman" w:eastAsia="Times New Roman" w:cs="Times New Roman"/>
+                <w:sz w:val="24"/>
+                <w:szCs w:val="24"/>
+                <w:color w:val="000000"/>
+              </w:rPr>
+              <w:t>100–125</w:t>
+            </w:r>
+          </w:p>
+        </w:tc>
+        <w:tc>
+          <w:tcPr>
+            <w:tcW w:type="dxa" w:w="3099"/>
+          </w:tcPr>
+          <w:p>
+            <w:r>
+              <w:rPr>
+                <w:rFonts w:ascii="Times New Roman" w:hAnsi="Times New Roman" w:eastAsia="Times New Roman" w:cs="Times New Roman"/>
+                <w:sz w:val="24"/>
+                <w:szCs w:val="24"/>
+                <w:color w:val="000000"/>
+              </w:rPr>
+              <w:t>140–199</w:t>
+            </w:r>
+          </w:p>
+        </w:tc>
+      </w:tr>
+      <w:tr>
+        <w:tc>
+          <w:tcPr>
+            <w:tcW w:type="dxa" w:w="3099"/>
+          </w:tcPr>
+          <w:p>
+            <w:r>
+              <w:rPr>
+                <w:rFonts w:ascii="Times New Roman" w:hAnsi="Times New Roman" w:eastAsia="Times New Roman" w:cs="Times New Roman"/>
+                <w:sz w:val="24"/>
+                <w:szCs w:val="24"/>
+                <w:color w:val="000000"/>
+              </w:rPr>
+              <w:t>Diabetes</w:t>
+            </w:r>
+          </w:p>
+        </w:tc>
+        <w:tc>
+          <w:tcPr>
+            <w:tcW w:type="dxa" w:w="3099"/>
+          </w:tcPr>
+          <w:p>
+            <w:r>
+              <w:rPr>
+                <w:rFonts w:ascii="Times New Roman" w:hAnsi="Times New Roman" w:eastAsia="Times New Roman" w:cs="Times New Roman"/>
+                <w:sz w:val="24"/>
+                <w:szCs w:val="24"/>
+                <w:color w:val="000000"/>
+              </w:rPr>
+              <w:t>≥126</w:t>
+            </w:r>
+          </w:p>
+        </w:tc>
+        <w:tc>
+          <w:tcPr>
+            <w:tcW w:type="dxa" w:w="3099"/>
+          </w:tcPr>
+          <w:p>
+            <w:r>
+              <w:rPr>
+                <w:rFonts w:ascii="Times New Roman" w:hAnsi="Times New Roman" w:eastAsia="Times New Roman" w:cs="Times New Roman"/>
+                <w:sz w:val="24"/>
+                <w:szCs w:val="24"/>
+                <w:color w:val="000000"/>
+              </w:rPr>
+              <w:t>≥200</w:t>
+            </w:r>
+          </w:p>
+        </w:tc>
+      </w:tr>
+    </w:tbl>
+    <w:p>
+      <w:pPr>
+        <w:spacing w:after="160"/>
+      </w:pPr>
+      <w:r>
+        <w:rPr>
+          <w:rFonts w:ascii="Times New Roman" w:hAnsi="Times New Roman" w:eastAsia="Times New Roman" w:cs="Times New Roman"/>
+          <w:sz w:val="24"/>
+          <w:szCs w:val="24"/>
+          <w:color w:val="000000"/>
+        </w:rPr>
+        <w:t>*La categoría normal en esta tabla se refiere a los límites superiores para detectar hiperglucemia; no clasifica valores bajos. Criterios ADA para plasma venoso y adultos no embarazados [1,2].</w:t>
+      </w:r>
+    </w:p>
+    <w:p>
+      <w:pPr>
+        <w:spacing w:after="160"/>
+      </w:pPr>
+      <w:r>
+        <w:rPr>
+          <w:rFonts w:ascii="Times New Roman" w:hAnsi="Times New Roman" w:eastAsia="Times New Roman" w:cs="Times New Roman"/>
+          <w:sz w:val="24"/>
+          <w:szCs w:val="24"/>
+          <w:color w:val="000000"/>
+        </w:rPr>
+        <w:t>La glucemia alterada en ayunas y la intolerancia a la glucosa pueden aparecer por separado; no es necesario que ambos valores estén alterados. Sin hiperglucemia inequívoca, el diagnóstico de diabetes requiere confirmación. Las lecturas capilares de esta práctica y el horario final aproximado no equivalen a una PTOG diagnóstica de laboratorio [1,2].</w:t>
+      </w:r>
+    </w:p>
+    <w:p>
+      <w:pPr>
+        <w:spacing w:after="160"/>
+      </w:pPr>
+      <w:r>
+        <w:rPr>
+          <w:rFonts w:ascii="Times New Roman" w:hAnsi="Times New Roman" w:eastAsia="Times New Roman" w:cs="Times New Roman"/>
+          <w:sz w:val="24"/>
+          <w:szCs w:val="24"/>
+          <w:color w:val="000000"/>
+        </w:rPr>
+        <w:br w:type="page"/>
+      </w:r>
+    </w:p>
+    <w:p>
+      <w:pPr>
+        <w:pStyle w:val="Heading1"/>
+        <w:spacing w:after="160"/>
+      </w:pPr>
+      <w:r>
+        <w:rPr>
+          <w:rFonts w:ascii="Times New Roman" w:hAnsi="Times New Roman" w:eastAsia="Times New Roman" w:cs="Times New Roman"/>
+          <w:sz w:val="24"/>
+          <w:szCs w:val="24"/>
+          <w:color w:val="000000"/>
+        </w:rPr>
+        <w:t>Cuestionario · continuación</w:t>
+      </w:r>
+    </w:p>
+    <w:p>
+      <w:pPr>
+        <w:pStyle w:val="Heading2"/>
+        <w:spacing w:after="160"/>
+      </w:pPr>
+      <w:r>
+        <w:rPr>
+          <w:rFonts w:ascii="Times New Roman" w:hAnsi="Times New Roman" w:eastAsia="Times New Roman" w:cs="Times New Roman"/>
+          <w:sz w:val="24"/>
+          <w:szCs w:val="24"/>
+          <w:color w:val="000000"/>
+        </w:rPr>
+        <w:t>3. Mencione dos indicaciones principales por las cuales se solicita una prueba de tolerancia a la glucosa, y explique en qué contexto es especialmente útil.</w:t>
+      </w:r>
+    </w:p>
+    <w:p>
+      <w:pPr>
+        <w:spacing w:after="160"/>
+      </w:pPr>
+      <w:r>
+        <w:rPr>
+          <w:rFonts w:ascii="Times New Roman" w:hAnsi="Times New Roman" w:eastAsia="Times New Roman" w:cs="Times New Roman"/>
+          <w:sz w:val="24"/>
+          <w:szCs w:val="24"/>
+          <w:color w:val="000000"/>
+        </w:rPr>
+        <w:t>Primera: esclarecer una sospecha de alteración del metabolismo de la glucosa cuando la glucemia en ayunas o la HbA1c son limítrofes o discordantes. La medición posterior a la carga puede detectar intolerancia a la glucosa que no se evidencia en ayunas [1,3].</w:t>
+      </w:r>
+    </w:p>
+    <w:p>
+      <w:pPr>
+        <w:spacing w:after="160"/>
+      </w:pPr>
+      <w:r>
+        <w:rPr>
+          <w:rFonts w:ascii="Times New Roman" w:hAnsi="Times New Roman" w:eastAsia="Times New Roman" w:cs="Times New Roman"/>
+          <w:sz w:val="24"/>
+          <w:szCs w:val="24"/>
+          <w:color w:val="000000"/>
+        </w:rPr>
+        <w:t>Segunda: evaluar a personas con riesgo elevado de diabetes tipo 2, por ejemplo, con sobrepeso u obesidad junto con antecedentes familiares u otros factores de riesgo, cuando la evaluación inicial no resuelve la sospecha. Resulta útil para identificar alteraciones poscarga y orientar el seguimiento. La selección de la prueba depende de la evaluación clínica; no todos los pacientes necesitan una PTOG [1,2].</w:t>
+      </w:r>
+    </w:p>
+    <w:p>
+      <w:pPr>
+        <w:pStyle w:val="Heading2"/>
+        <w:spacing w:after="160"/>
+      </w:pPr>
+      <w:r>
+        <w:rPr>
+          <w:rFonts w:ascii="Times New Roman" w:hAnsi="Times New Roman" w:eastAsia="Times New Roman" w:cs="Times New Roman"/>
+          <w:sz w:val="24"/>
+          <w:szCs w:val="24"/>
+          <w:color w:val="000000"/>
+        </w:rPr>
+        <w:t>4. Antes de someter a un paciente con diabetes a un test de ejercicio modificado, ¿en qué situaciones clínicas estaría formalmente contraindicado o requeriría una evaluación cardiovascular previa exhaustiva?</w:t>
+      </w:r>
+    </w:p>
+    <w:p>
+      <w:pPr>
+        <w:spacing w:after="160"/>
+      </w:pPr>
+      <w:r>
+        <w:rPr>
+          <w:rFonts w:ascii="Times New Roman" w:hAnsi="Times New Roman" w:eastAsia="Times New Roman" w:cs="Times New Roman"/>
+          <w:sz w:val="24"/>
+          <w:szCs w:val="24"/>
+          <w:color w:val="000000"/>
+        </w:rPr>
+        <w:t>Debe posponerse ante hipoglucemia no corregida, cetoacidosis o hiperglucemia acompañada de cetosis significativa. Ante enfermedad cardiovascular inestable —como angina inestable, insuficiencia cardíaca descompensada o arritmias con repercusión clínica— no se debe iniciar una prueba docente de ejercicio; corresponde estabilización y valoración médica [4].</w:t>
+      </w:r>
+    </w:p>
+    <w:p>
+      <w:pPr>
+        <w:spacing w:after="160"/>
+      </w:pPr>
+      <w:r>
+        <w:rPr>
+          <w:rFonts w:ascii="Times New Roman" w:hAnsi="Times New Roman" w:eastAsia="Times New Roman" w:cs="Times New Roman"/>
+          <w:sz w:val="24"/>
+          <w:szCs w:val="24"/>
+          <w:color w:val="000000"/>
+        </w:rPr>
+        <w:t>Dolor torácico, disnea desproporcionada, síncope, cardiopatía conocida, neuropatía autonómica o la intención de realizar actividad intensa justifican una evaluación individual previa. El profesional decide si requiere electrocardiograma, prueba de esfuerzo supervisada u otros estudios. Tener diabetes, por sí solo, no obliga a un estudio cardiovascular exhaustivo antes de actividad ligera o moderada en una persona asintomática [4].</w:t>
+      </w:r>
+    </w:p>
+    <w:p>
+      <w:pPr>
+        <w:spacing w:after="160"/>
+      </w:pPr>
+      <w:r>
+        <w:rPr>
+          <w:rFonts w:ascii="Times New Roman" w:hAnsi="Times New Roman" w:eastAsia="Times New Roman" w:cs="Times New Roman"/>
+          <w:sz w:val="24"/>
+          <w:szCs w:val="24"/>
+          <w:color w:val="000000"/>
+        </w:rPr>
+        <w:t>Además, la retinopatía proliferativa inestable exige evitar esfuerzos intensos; las úlceras activas del pie requieren modificar las actividades con carga. Deben revisarse medicación, glucemia, hidratación y capacidad funcional [4].</w:t>
+      </w:r>
+    </w:p>
+    <w:p>
+      <w:pPr>
+        <w:spacing w:after="160"/>
+      </w:pPr>
+      <w:r>
+        <w:rPr>
+          <w:rFonts w:ascii="Times New Roman" w:hAnsi="Times New Roman" w:eastAsia="Times New Roman" w:cs="Times New Roman"/>
+          <w:sz w:val="24"/>
+          <w:szCs w:val="24"/>
+          <w:color w:val="000000"/>
+        </w:rPr>
+        <w:br w:type="page"/>
+      </w:r>
+    </w:p>
+    <w:p>
+      <w:pPr>
+        <w:pStyle w:val="Heading1"/>
+        <w:spacing w:after="160"/>
+      </w:pPr>
+      <w:r>
+        <w:rPr>
+          <w:rFonts w:ascii="Times New Roman" w:hAnsi="Times New Roman" w:eastAsia="Times New Roman" w:cs="Times New Roman"/>
+          <w:sz w:val="24"/>
+          <w:szCs w:val="24"/>
+          <w:color w:val="000000"/>
+        </w:rPr>
+        <w:t>Bibliografía</w:t>
+      </w:r>
+    </w:p>
+    <w:p>
+      <w:pPr>
+        <w:spacing w:after="240" w:line="240" w:lineRule="auto"/>
+      </w:pPr>
+      <w:r>
+        <w:rPr>
+          <w:rFonts w:ascii="Times New Roman" w:hAnsi="Times New Roman" w:eastAsia="Times New Roman" w:cs="Times New Roman"/>
+          <w:sz w:val="24"/>
+          <w:szCs w:val="24"/>
+          <w:color w:val="000000"/>
+        </w:rPr>
+        <w:t>1. American Diabetes Association Professional Practice Committee. 2. Diagnosis and classification of diabetes: Standards of Care in Diabetes—2026. Diabetes Care. 2026;49(Suppl 1):S27-S49. doi:10.2337/dc26-S002.</w:t>
+      </w:r>
+    </w:p>
+    <w:p>
+      <w:pPr>
+        <w:spacing w:after="240" w:line="240" w:lineRule="auto"/>
+      </w:pPr>
+      <w:r>
+        <w:rPr>
+          <w:rFonts w:ascii="Times New Roman" w:hAnsi="Times New Roman" w:eastAsia="Times New Roman" w:cs="Times New Roman"/>
+          <w:sz w:val="24"/>
+          <w:szCs w:val="24"/>
+          <w:color w:val="000000"/>
+        </w:rPr>
+        <w:t>2. National Institute of Diabetes and Digestive and Kidney Diseases. Diabetes tests &amp; diagnosis [Internet]. Bethesda (MD): NIDDK; 2022 [citado 21 oct 2026]. Disponible en: https://www.niddk.nih.gov/health-information/diabetes/overview/tests-diagnosis</w:t>
+      </w:r>
+    </w:p>
+    <w:p>
+      <w:pPr>
+        <w:spacing w:after="240" w:line="240" w:lineRule="auto"/>
+      </w:pPr>
+      <w:r>
+        <w:rPr>
+          <w:rFonts w:ascii="Times New Roman" w:hAnsi="Times New Roman" w:eastAsia="Times New Roman" w:cs="Times New Roman"/>
+          <w:sz w:val="24"/>
+          <w:szCs w:val="24"/>
+          <w:color w:val="000000"/>
+        </w:rPr>
+        <w:t>3. Phillips PJ. Oral glucose tolerance testing. Aust Fam Physician. 2012;41(6):391-3.</w:t>
+      </w:r>
+    </w:p>
+    <w:p>
+      <w:pPr>
+        <w:spacing w:after="240" w:line="240" w:lineRule="auto"/>
+      </w:pPr>
+      <w:r>
+        <w:rPr>
+          <w:rFonts w:ascii="Times New Roman" w:hAnsi="Times New Roman" w:eastAsia="Times New Roman" w:cs="Times New Roman"/>
+          <w:sz w:val="24"/>
+          <w:szCs w:val="24"/>
+          <w:color w:val="000000"/>
+        </w:rPr>
+        <w:t>4. Colberg SR, Sigal RJ, Yardley JE, Riddell MC, Dunstan DW, Dempsey PC, et al. Physical activity/exercise and diabetes: a position statement of the American Diabetes Association. Diabetes Care. 2016;39(11):2065-79. doi:10.2337/dc16-1728.</w:t>
       </w:r>
     </w:p>
     <w:sectPr>
@@ -1024,8 +1297,9 @@
       <w:spacing w:after="160" w:line="271" w:lineRule="auto"/>
     </w:pPr>
     <w:rPr>
-      <w:rFonts w:ascii="Calibri" w:hAnsi="Calibri"/>
-      <w:sz w:val="22"/>
+      <w:rFonts w:ascii="Times New Roman" w:hAnsi="Times New Roman"/>
+      <w:color w:val="000000"/>
+      <w:sz w:val="24"/>
     </w:rPr>
   </w:style>
   <w:style w:type="paragraph" w:styleId="Header">
@@ -1042,6 +1316,11 @@
       </w:tabs>
       <w:spacing w:after="0" w:line="240" w:lineRule="auto"/>
     </w:pPr>
+    <w:rPr>
+      <w:rFonts w:ascii="Times New Roman" w:hAnsi="Times New Roman"/>
+      <w:color w:val="000000"/>
+      <w:sz w:val="24"/>
+    </w:rPr>
   </w:style>
   <w:style w:type="character" w:customStyle="1" w:styleId="HeaderChar">
     <w:name w:val="Header Char"/>
@@ -1049,6 +1328,11 @@
     <w:link w:val="Header"/>
     <w:uiPriority w:val="99"/>
     <w:rsid w:val="00E618BF"/>
+    <w:rPr>
+      <w:rFonts w:ascii="Times New Roman" w:hAnsi="Times New Roman"/>
+      <w:color w:val="000000"/>
+      <w:sz w:val="24"/>
+    </w:rPr>
   </w:style>
   <w:style w:type="paragraph" w:styleId="Footer">
     <w:name w:val="footer"/>
@@ -1064,6 +1348,11 @@
       </w:tabs>
       <w:spacing w:after="0" w:line="240" w:lineRule="auto"/>
     </w:pPr>
+    <w:rPr>
+      <w:rFonts w:ascii="Times New Roman" w:hAnsi="Times New Roman"/>
+      <w:color w:val="000000"/>
+      <w:sz w:val="24"/>
+    </w:rPr>
   </w:style>
   <w:style w:type="character" w:customStyle="1" w:styleId="FooterChar">
     <w:name w:val="Footer Char"/>
@@ -1071,6 +1360,11 @@
     <w:link w:val="Footer"/>
     <w:uiPriority w:val="99"/>
     <w:rsid w:val="00E618BF"/>
+    <w:rPr>
+      <w:rFonts w:ascii="Times New Roman" w:hAnsi="Times New Roman"/>
+      <w:color w:val="000000"/>
+      <w:sz w:val="24"/>
+    </w:rPr>
   </w:style>
   <w:style w:type="paragraph" w:styleId="Heading1">
     <w:name w:val="heading 1"/>
@@ -1087,11 +1381,11 @@
       <w:outlineLvl w:val="0"/>
     </w:pPr>
     <w:rPr>
-      <w:rFonts w:asciiTheme="majorHAnsi" w:eastAsiaTheme="majorEastAsia" w:hAnsiTheme="majorHAnsi" w:cstheme="majorBidi" w:ascii="Calibri" w:hAnsi="Calibri"/>
+      <w:rFonts w:asciiTheme="majorHAnsi" w:eastAsiaTheme="majorEastAsia" w:hAnsiTheme="majorHAnsi" w:cstheme="majorBidi" w:ascii="Times New Roman" w:hAnsi="Times New Roman"/>
       <w:b/>
       <w:bCs/>
-      <w:color w:val="163B8C"/>
-      <w:sz w:val="34"/>
+      <w:color w:val="000000"/>
+      <w:sz w:val="24"/>
       <w:szCs w:val="28"/>
     </w:rPr>
   </w:style>
@@ -1111,10 +1405,10 @@
       <w:outlineLvl w:val="1"/>
     </w:pPr>
     <w:rPr>
-      <w:rFonts w:asciiTheme="majorHAnsi" w:eastAsiaTheme="majorEastAsia" w:hAnsiTheme="majorHAnsi" w:cstheme="majorBidi" w:ascii="Calibri" w:hAnsi="Calibri"/>
+      <w:rFonts w:asciiTheme="majorHAnsi" w:eastAsiaTheme="majorEastAsia" w:hAnsiTheme="majorHAnsi" w:cstheme="majorBidi" w:ascii="Times New Roman" w:hAnsi="Times New Roman"/>
       <w:b/>
       <w:bCs/>
-      <w:color w:val="163B8C"/>
+      <w:color w:val="000000"/>
       <w:sz w:val="24"/>
       <w:szCs w:val="26"/>
     </w:rPr>
@@ -1135,10 +1429,11 @@
       <w:outlineLvl w:val="2"/>
     </w:pPr>
     <w:rPr>
-      <w:rFonts w:asciiTheme="majorHAnsi" w:eastAsiaTheme="majorEastAsia" w:hAnsiTheme="majorHAnsi" w:cstheme="majorBidi"/>
+      <w:rFonts w:asciiTheme="majorHAnsi" w:eastAsiaTheme="majorEastAsia" w:hAnsiTheme="majorHAnsi" w:cstheme="majorBidi" w:ascii="Times New Roman" w:hAnsi="Times New Roman"/>
       <w:b/>
       <w:bCs/>
-      <w:color w:val="4F81BD" w:themeColor="accent1"/>
+      <w:color w:val="000000"/>
+      <w:sz w:val="24"/>
     </w:rPr>
   </w:style>
   <w:style w:type="paragraph" w:styleId="Heading4">
@@ -1158,12 +1453,13 @@
       <w:outlineLvl w:val="3"/>
     </w:pPr>
     <w:rPr>
-      <w:rFonts w:asciiTheme="majorHAnsi" w:eastAsiaTheme="majorEastAsia" w:hAnsiTheme="majorHAnsi" w:cstheme="majorBidi"/>
+      <w:rFonts w:asciiTheme="majorHAnsi" w:eastAsiaTheme="majorEastAsia" w:hAnsiTheme="majorHAnsi" w:cstheme="majorBidi" w:ascii="Times New Roman" w:hAnsi="Times New Roman"/>
       <w:b/>
       <w:bCs/>
       <w:i/>
       <w:iCs/>
-      <w:color w:val="4F81BD" w:themeColor="accent1"/>
+      <w:color w:val="000000"/>
+      <w:sz w:val="24"/>
     </w:rPr>
   </w:style>
   <w:style w:type="paragraph" w:styleId="Heading5">
@@ -1183,8 +1479,9 @@
       <w:outlineLvl w:val="4"/>
     </w:pPr>
     <w:rPr>
-      <w:rFonts w:asciiTheme="majorHAnsi" w:eastAsiaTheme="majorEastAsia" w:hAnsiTheme="majorHAnsi" w:cstheme="majorBidi"/>
-      <w:color w:val="243F60" w:themeColor="accent1" w:themeShade="7F"/>
+      <w:rFonts w:asciiTheme="majorHAnsi" w:eastAsiaTheme="majorEastAsia" w:hAnsiTheme="majorHAnsi" w:cstheme="majorBidi" w:ascii="Times New Roman" w:hAnsi="Times New Roman"/>
+      <w:color w:val="000000"/>
+      <w:sz w:val="24"/>
     </w:rPr>
   </w:style>
   <w:style w:type="paragraph" w:styleId="Heading6">
@@ -1204,10 +1501,11 @@
       <w:outlineLvl w:val="5"/>
     </w:pPr>
     <w:rPr>
-      <w:rFonts w:asciiTheme="majorHAnsi" w:eastAsiaTheme="majorEastAsia" w:hAnsiTheme="majorHAnsi" w:cstheme="majorBidi"/>
+      <w:rFonts w:asciiTheme="majorHAnsi" w:eastAsiaTheme="majorEastAsia" w:hAnsiTheme="majorHAnsi" w:cstheme="majorBidi" w:ascii="Times New Roman" w:hAnsi="Times New Roman"/>
       <w:i/>
       <w:iCs/>
-      <w:color w:val="243F60" w:themeColor="accent1" w:themeShade="7F"/>
+      <w:color w:val="000000"/>
+      <w:sz w:val="24"/>
     </w:rPr>
   </w:style>
   <w:style w:type="paragraph" w:styleId="Heading7">
@@ -1227,10 +1525,11 @@
       <w:outlineLvl w:val="6"/>
     </w:pPr>
     <w:rPr>
-      <w:rFonts w:asciiTheme="majorHAnsi" w:eastAsiaTheme="majorEastAsia" w:hAnsiTheme="majorHAnsi" w:cstheme="majorBidi"/>
+      <w:rFonts w:asciiTheme="majorHAnsi" w:eastAsiaTheme="majorEastAsia" w:hAnsiTheme="majorHAnsi" w:cstheme="majorBidi" w:ascii="Times New Roman" w:hAnsi="Times New Roman"/>
       <w:i/>
       <w:iCs/>
-      <w:color w:val="404040" w:themeColor="text1" w:themeTint="BF"/>
+      <w:color w:val="000000"/>
+      <w:sz w:val="24"/>
     </w:rPr>
   </w:style>
   <w:style w:type="paragraph" w:styleId="Heading8">
@@ -1250,9 +1549,9 @@
       <w:outlineLvl w:val="7"/>
     </w:pPr>
     <w:rPr>
-      <w:rFonts w:asciiTheme="majorHAnsi" w:eastAsiaTheme="majorEastAsia" w:hAnsiTheme="majorHAnsi" w:cstheme="majorBidi"/>
-      <w:color w:val="4F81BD" w:themeColor="accent1"/>
-      <w:sz w:val="20"/>
+      <w:rFonts w:asciiTheme="majorHAnsi" w:eastAsiaTheme="majorEastAsia" w:hAnsiTheme="majorHAnsi" w:cstheme="majorBidi" w:ascii="Times New Roman" w:hAnsi="Times New Roman"/>
+      <w:color w:val="000000"/>
+      <w:sz w:val="24"/>
       <w:szCs w:val="20"/>
     </w:rPr>
   </w:style>
@@ -1273,11 +1572,11 @@
       <w:outlineLvl w:val="8"/>
     </w:pPr>
     <w:rPr>
-      <w:rFonts w:asciiTheme="majorHAnsi" w:eastAsiaTheme="majorEastAsia" w:hAnsiTheme="majorHAnsi" w:cstheme="majorBidi"/>
+      <w:rFonts w:asciiTheme="majorHAnsi" w:eastAsiaTheme="majorEastAsia" w:hAnsiTheme="majorHAnsi" w:cstheme="majorBidi" w:ascii="Times New Roman" w:hAnsi="Times New Roman"/>
       <w:i/>
       <w:iCs/>
-      <w:color w:val="404040" w:themeColor="text1" w:themeTint="BF"/>
-      <w:sz w:val="20"/>
+      <w:color w:val="000000"/>
+      <w:sz w:val="24"/>
       <w:szCs w:val="20"/>
     </w:rPr>
   </w:style>
@@ -1286,12 +1585,22 @@
     <w:uiPriority w:val="1"/>
     <w:semiHidden/>
     <w:unhideWhenUsed/>
+    <w:rPr>
+      <w:rFonts w:ascii="Times New Roman" w:hAnsi="Times New Roman"/>
+      <w:color w:val="000000"/>
+      <w:sz w:val="24"/>
+    </w:rPr>
   </w:style>
   <w:style w:type="table" w:default="1" w:styleId="TableNormal">
     <w:name w:val="Normal Table"/>
     <w:uiPriority w:val="99"/>
     <w:semiHidden/>
     <w:unhideWhenUsed/>
+    <w:rPr>
+      <w:rFonts w:ascii="Times New Roman" w:hAnsi="Times New Roman"/>
+      <w:color w:val="000000"/>
+      <w:sz w:val="24"/>
+    </w:rPr>
     <w:tblPr>
       <w:tblInd w:w="0" w:type="dxa"/>
       <w:tblCellMar>
@@ -1316,6 +1625,11 @@
     <w:pPr>
       <w:spacing w:after="0" w:line="240" w:lineRule="auto"/>
     </w:pPr>
+    <w:rPr>
+      <w:rFonts w:ascii="Times New Roman" w:hAnsi="Times New Roman"/>
+      <w:color w:val="000000"/>
+      <w:sz w:val="24"/>
+    </w:rPr>
   </w:style>
   <w:style w:type="character" w:customStyle="1" w:styleId="Heading1Char">
     <w:name w:val="Heading 1 Char"/>
@@ -1324,11 +1638,11 @@
     <w:uiPriority w:val="9"/>
     <w:rsid w:val="00FC693F"/>
     <w:rPr>
-      <w:rFonts w:asciiTheme="majorHAnsi" w:eastAsiaTheme="majorEastAsia" w:hAnsiTheme="majorHAnsi" w:cstheme="majorBidi"/>
+      <w:rFonts w:asciiTheme="majorHAnsi" w:eastAsiaTheme="majorEastAsia" w:hAnsiTheme="majorHAnsi" w:cstheme="majorBidi" w:ascii="Times New Roman" w:hAnsi="Times New Roman"/>
       <w:b/>
       <w:bCs/>
-      <w:color w:val="365F91" w:themeColor="accent1" w:themeShade="BF"/>
-      <w:sz w:val="28"/>
+      <w:color w:val="000000"/>
+      <w:sz w:val="24"/>
       <w:szCs w:val="28"/>
     </w:rPr>
   </w:style>
@@ -1339,11 +1653,11 @@
     <w:uiPriority w:val="9"/>
     <w:rsid w:val="00FC693F"/>
     <w:rPr>
-      <w:rFonts w:asciiTheme="majorHAnsi" w:eastAsiaTheme="majorEastAsia" w:hAnsiTheme="majorHAnsi" w:cstheme="majorBidi"/>
+      <w:rFonts w:asciiTheme="majorHAnsi" w:eastAsiaTheme="majorEastAsia" w:hAnsiTheme="majorHAnsi" w:cstheme="majorBidi" w:ascii="Times New Roman" w:hAnsi="Times New Roman"/>
       <w:b/>
       <w:bCs/>
-      <w:color w:val="4F81BD" w:themeColor="accent1"/>
-      <w:sz w:val="26"/>
+      <w:color w:val="000000"/>
+      <w:sz w:val="24"/>
       <w:szCs w:val="26"/>
     </w:rPr>
   </w:style>
@@ -1354,10 +1668,11 @@
     <w:uiPriority w:val="9"/>
     <w:rsid w:val="00FC693F"/>
     <w:rPr>
-      <w:rFonts w:asciiTheme="majorHAnsi" w:eastAsiaTheme="majorEastAsia" w:hAnsiTheme="majorHAnsi" w:cstheme="majorBidi"/>
+      <w:rFonts w:asciiTheme="majorHAnsi" w:eastAsiaTheme="majorEastAsia" w:hAnsiTheme="majorHAnsi" w:cstheme="majorBidi" w:ascii="Times New Roman" w:hAnsi="Times New Roman"/>
       <w:b/>
       <w:bCs/>
-      <w:color w:val="4F81BD" w:themeColor="accent1"/>
+      <w:color w:val="000000"/>
+      <w:sz w:val="24"/>
     </w:rPr>
   </w:style>
   <w:style w:type="paragraph" w:styleId="Title">
@@ -1376,11 +1691,11 @@
       <w:contextualSpacing/>
     </w:pPr>
     <w:rPr>
-      <w:rFonts w:asciiTheme="majorHAnsi" w:eastAsiaTheme="majorEastAsia" w:hAnsiTheme="majorHAnsi" w:cstheme="majorBidi" w:ascii="Calibri" w:hAnsi="Calibri"/>
-      <w:color w:val="163B8C"/>
+      <w:rFonts w:asciiTheme="majorHAnsi" w:eastAsiaTheme="majorEastAsia" w:hAnsiTheme="majorHAnsi" w:cstheme="majorBidi" w:ascii="Times New Roman" w:hAnsi="Times New Roman"/>
+      <w:color w:val="000000"/>
       <w:spacing w:val="5"/>
       <w:kern w:val="28"/>
-      <w:sz w:val="50"/>
+      <w:sz w:val="24"/>
       <w:szCs w:val="52"/>
     </w:rPr>
   </w:style>
@@ -1391,11 +1706,11 @@
     <w:uiPriority w:val="10"/>
     <w:rsid w:val="00FC693F"/>
     <w:rPr>
-      <w:rFonts w:asciiTheme="majorHAnsi" w:eastAsiaTheme="majorEastAsia" w:hAnsiTheme="majorHAnsi" w:cstheme="majorBidi"/>
-      <w:color w:val="17365D" w:themeColor="text2" w:themeShade="BF"/>
+      <w:rFonts w:asciiTheme="majorHAnsi" w:eastAsiaTheme="majorEastAsia" w:hAnsiTheme="majorHAnsi" w:cstheme="majorBidi" w:ascii="Times New Roman" w:hAnsi="Times New Roman"/>
+      <w:color w:val="000000"/>
       <w:spacing w:val="5"/>
       <w:kern w:val="28"/>
-      <w:sz w:val="52"/>
+      <w:sz w:val="24"/>
       <w:szCs w:val="52"/>
     </w:rPr>
   </w:style>
@@ -1414,12 +1729,12 @@
       <w:spacing w:after="160"/>
     </w:pPr>
     <w:rPr>
-      <w:rFonts w:asciiTheme="majorHAnsi" w:eastAsiaTheme="majorEastAsia" w:hAnsiTheme="majorHAnsi" w:cstheme="majorBidi" w:ascii="Calibri" w:hAnsi="Calibri"/>
+      <w:rFonts w:asciiTheme="majorHAnsi" w:eastAsiaTheme="majorEastAsia" w:hAnsiTheme="majorHAnsi" w:cstheme="majorBidi" w:ascii="Times New Roman" w:hAnsi="Times New Roman"/>
       <w:i/>
       <w:iCs/>
-      <w:color w:val="4F81BD" w:themeColor="accent1"/>
+      <w:color w:val="000000"/>
       <w:spacing w:val="15"/>
-      <w:sz w:val="22"/>
+      <w:sz w:val="24"/>
       <w:szCs w:val="24"/>
     </w:rPr>
   </w:style>
@@ -1430,10 +1745,10 @@
     <w:uiPriority w:val="11"/>
     <w:rsid w:val="00FC693F"/>
     <w:rPr>
-      <w:rFonts w:asciiTheme="majorHAnsi" w:eastAsiaTheme="majorEastAsia" w:hAnsiTheme="majorHAnsi" w:cstheme="majorBidi"/>
+      <w:rFonts w:asciiTheme="majorHAnsi" w:eastAsiaTheme="majorEastAsia" w:hAnsiTheme="majorHAnsi" w:cstheme="majorBidi" w:ascii="Times New Roman" w:hAnsi="Times New Roman"/>
       <w:i/>
       <w:iCs/>
-      <w:color w:val="4F81BD" w:themeColor="accent1"/>
+      <w:color w:val="000000"/>
       <w:spacing w:val="15"/>
       <w:sz w:val="24"/>
       <w:szCs w:val="24"/>
@@ -1449,6 +1764,11 @@
       <w:ind w:left="720"/>
       <w:contextualSpacing/>
     </w:pPr>
+    <w:rPr>
+      <w:rFonts w:ascii="Times New Roman" w:hAnsi="Times New Roman"/>
+      <w:color w:val="000000"/>
+      <w:sz w:val="24"/>
+    </w:rPr>
   </w:style>
   <w:style w:type="paragraph" w:styleId="BodyText">
     <w:name w:val="Body Text"/>
@@ -1460,6 +1780,11 @@
     <w:pPr>
       <w:spacing w:after="120"/>
     </w:pPr>
+    <w:rPr>
+      <w:rFonts w:ascii="Times New Roman" w:hAnsi="Times New Roman"/>
+      <w:color w:val="000000"/>
+      <w:sz w:val="24"/>
+    </w:rPr>
   </w:style>
   <w:style w:type="character" w:customStyle="1" w:styleId="BodyTextChar">
     <w:name w:val="Body Text Char"/>
@@ -1467,6 +1792,11 @@
     <w:link w:val="BodyText"/>
     <w:uiPriority w:val="99"/>
     <w:rsid w:val="00AA1D8D"/>
+    <w:rPr>
+      <w:rFonts w:ascii="Times New Roman" w:hAnsi="Times New Roman"/>
+      <w:color w:val="000000"/>
+      <w:sz w:val="24"/>
+    </w:rPr>
   </w:style>
   <w:style w:type="paragraph" w:styleId="BodyText2">
     <w:name w:val="Body Text 2"/>
@@ -1478,6 +1808,11 @@
     <w:pPr>
       <w:spacing w:after="120" w:line="480" w:lineRule="auto"/>
     </w:pPr>
+    <w:rPr>
+      <w:rFonts w:ascii="Times New Roman" w:hAnsi="Times New Roman"/>
+      <w:color w:val="000000"/>
+      <w:sz w:val="24"/>
+    </w:rPr>
   </w:style>
   <w:style w:type="character" w:customStyle="1" w:styleId="BodyText2Char">
     <w:name w:val="Body Text 2 Char"/>
@@ -1485,6 +1820,11 @@
     <w:link w:val="BodyText2"/>
     <w:uiPriority w:val="99"/>
     <w:rsid w:val="00AA1D8D"/>
+    <w:rPr>
+      <w:rFonts w:ascii="Times New Roman" w:hAnsi="Times New Roman"/>
+      <w:color w:val="000000"/>
+      <w:sz w:val="24"/>
+    </w:rPr>
   </w:style>
   <w:style w:type="paragraph" w:styleId="BodyText3">
     <w:name w:val="Body Text 3"/>
@@ -1497,7 +1837,9 @@
       <w:spacing w:after="120"/>
     </w:pPr>
     <w:rPr>
-      <w:sz w:val="16"/>
+      <w:rFonts w:ascii="Times New Roman" w:hAnsi="Times New Roman"/>
+      <w:color w:val="000000"/>
+      <w:sz w:val="24"/>
       <w:szCs w:val="16"/>
     </w:rPr>
   </w:style>
@@ -1508,7 +1850,9 @@
     <w:uiPriority w:val="99"/>
     <w:rsid w:val="00AA1D8D"/>
     <w:rPr>
-      <w:sz w:val="16"/>
+      <w:rFonts w:ascii="Times New Roman" w:hAnsi="Times New Roman"/>
+      <w:color w:val="000000"/>
+      <w:sz w:val="24"/>
       <w:szCs w:val="16"/>
     </w:rPr>
   </w:style>
@@ -1522,6 +1866,11 @@
       <w:ind w:left="360" w:hanging="360"/>
       <w:contextualSpacing/>
     </w:pPr>
+    <w:rPr>
+      <w:rFonts w:ascii="Times New Roman" w:hAnsi="Times New Roman"/>
+      <w:color w:val="000000"/>
+      <w:sz w:val="24"/>
+    </w:rPr>
   </w:style>
   <w:style w:type="paragraph" w:styleId="List2">
     <w:name w:val="List 2"/>
@@ -1533,6 +1882,11 @@
       <w:ind w:left="720" w:hanging="360"/>
       <w:contextualSpacing/>
     </w:pPr>
+    <w:rPr>
+      <w:rFonts w:ascii="Times New Roman" w:hAnsi="Times New Roman"/>
+      <w:color w:val="000000"/>
+      <w:sz w:val="24"/>
+    </w:rPr>
   </w:style>
   <w:style w:type="paragraph" w:styleId="List3">
     <w:name w:val="List 3"/>
@@ -1544,6 +1898,11 @@
       <w:ind w:left="1080" w:hanging="360"/>
       <w:contextualSpacing/>
     </w:pPr>
+    <w:rPr>
+      <w:rFonts w:ascii="Times New Roman" w:hAnsi="Times New Roman"/>
+      <w:color w:val="000000"/>
+      <w:sz w:val="24"/>
+    </w:rPr>
   </w:style>
   <w:style w:type="paragraph" w:styleId="ListBullet">
     <w:name w:val="List Bullet"/>
@@ -1557,6 +1916,11 @@
       </w:numPr>
       <w:contextualSpacing/>
     </w:pPr>
+    <w:rPr>
+      <w:rFonts w:ascii="Times New Roman" w:hAnsi="Times New Roman"/>
+      <w:color w:val="000000"/>
+      <w:sz w:val="24"/>
+    </w:rPr>
   </w:style>
   <w:style w:type="paragraph" w:styleId="ListBullet2">
     <w:name w:val="List Bullet 2"/>
@@ -1570,6 +1934,11 @@
       </w:numPr>
       <w:contextualSpacing/>
     </w:pPr>
+    <w:rPr>
+      <w:rFonts w:ascii="Times New Roman" w:hAnsi="Times New Roman"/>
+      <w:color w:val="000000"/>
+      <w:sz w:val="24"/>
+    </w:rPr>
   </w:style>
   <w:style w:type="paragraph" w:styleId="ListBullet3">
     <w:name w:val="List Bullet 3"/>
@@ -1583,6 +1952,11 @@
       </w:numPr>
       <w:contextualSpacing/>
     </w:pPr>
+    <w:rPr>
+      <w:rFonts w:ascii="Times New Roman" w:hAnsi="Times New Roman"/>
+      <w:color w:val="000000"/>
+      <w:sz w:val="24"/>
+    </w:rPr>
   </w:style>
   <w:style w:type="paragraph" w:styleId="ListNumber">
     <w:name w:val="List Number"/>
@@ -1596,6 +1970,11 @@
       </w:numPr>
       <w:contextualSpacing/>
     </w:pPr>
+    <w:rPr>
+      <w:rFonts w:ascii="Times New Roman" w:hAnsi="Times New Roman"/>
+      <w:color w:val="000000"/>
+      <w:sz w:val="24"/>
+    </w:rPr>
   </w:style>
   <w:style w:type="paragraph" w:styleId="ListNumber2">
     <w:name w:val="List Number 2"/>
@@ -1609,6 +1988,11 @@
       </w:numPr>
       <w:contextualSpacing/>
     </w:pPr>
+    <w:rPr>
+      <w:rFonts w:ascii="Times New Roman" w:hAnsi="Times New Roman"/>
+      <w:color w:val="000000"/>
+      <w:sz w:val="24"/>
+    </w:rPr>
   </w:style>
   <w:style w:type="paragraph" w:styleId="ListNumber3">
     <w:name w:val="List Number 3"/>
@@ -1622,6 +2006,11 @@
       </w:numPr>
       <w:contextualSpacing/>
     </w:pPr>
+    <w:rPr>
+      <w:rFonts w:ascii="Times New Roman" w:hAnsi="Times New Roman"/>
+      <w:color w:val="000000"/>
+      <w:sz w:val="24"/>
+    </w:rPr>
   </w:style>
   <w:style w:type="paragraph" w:styleId="ListContinue">
     <w:name w:val="List Continue"/>
@@ -1634,6 +2023,11 @@
       <w:ind w:left="360"/>
       <w:contextualSpacing/>
     </w:pPr>
+    <w:rPr>
+      <w:rFonts w:ascii="Times New Roman" w:hAnsi="Times New Roman"/>
+      <w:color w:val="000000"/>
+      <w:sz w:val="24"/>
+    </w:rPr>
   </w:style>
   <w:style w:type="paragraph" w:styleId="ListContinue2">
     <w:name w:val="List Continue 2"/>
@@ -1646,6 +2040,11 @@
       <w:ind w:left="720"/>
       <w:contextualSpacing/>
     </w:pPr>
+    <w:rPr>
+      <w:rFonts w:ascii="Times New Roman" w:hAnsi="Times New Roman"/>
+      <w:color w:val="000000"/>
+      <w:sz w:val="24"/>
+    </w:rPr>
   </w:style>
   <w:style w:type="paragraph" w:styleId="ListContinue3">
     <w:name w:val="List Continue 3"/>
@@ -1658,6 +2057,11 @@
       <w:ind w:left="1080"/>
       <w:contextualSpacing/>
     </w:pPr>
+    <w:rPr>
+      <w:rFonts w:ascii="Times New Roman" w:hAnsi="Times New Roman"/>
+      <w:color w:val="000000"/>
+      <w:sz w:val="24"/>
+    </w:rPr>
   </w:style>
   <w:style w:type="paragraph" w:styleId="MacroText">
     <w:name w:val="macro"/>
@@ -1677,8 +2081,9 @@
       </w:tabs>
     </w:pPr>
     <w:rPr>
-      <w:rFonts w:ascii="Courier" w:hAnsi="Courier"/>
-      <w:sz w:val="20"/>
+      <w:rFonts w:ascii="Times New Roman" w:hAnsi="Times New Roman"/>
+      <w:color w:val="000000"/>
+      <w:sz w:val="24"/>
       <w:szCs w:val="20"/>
     </w:rPr>
   </w:style>
@@ -1689,8 +2094,9 @@
     <w:uiPriority w:val="99"/>
     <w:rsid w:val="0029639D"/>
     <w:rPr>
-      <w:rFonts w:ascii="Courier" w:hAnsi="Courier"/>
-      <w:sz w:val="20"/>
+      <w:rFonts w:ascii="Times New Roman" w:hAnsi="Times New Roman"/>
+      <w:color w:val="000000"/>
+      <w:sz w:val="24"/>
       <w:szCs w:val="20"/>
     </w:rPr>
   </w:style>
@@ -1703,9 +2109,11 @@
     <w:qFormat/>
     <w:rsid w:val="00FC693F"/>
     <w:rPr>
+      <w:rFonts w:ascii="Times New Roman" w:hAnsi="Times New Roman"/>
       <w:i/>
       <w:iCs/>
-      <w:color w:val="000000" w:themeColor="text1"/>
+      <w:color w:val="000000"/>
+      <w:sz w:val="24"/>
     </w:rPr>
   </w:style>
   <w:style w:type="character" w:customStyle="1" w:styleId="QuoteChar">
@@ -1715,9 +2123,11 @@
     <w:uiPriority w:val="29"/>
     <w:rsid w:val="00FC693F"/>
     <w:rPr>
+      <w:rFonts w:ascii="Times New Roman" w:hAnsi="Times New Roman"/>
       <w:i/>
       <w:iCs/>
-      <w:color w:val="000000" w:themeColor="text1"/>
+      <w:color w:val="000000"/>
+      <w:sz w:val="24"/>
     </w:rPr>
   </w:style>
   <w:style w:type="character" w:customStyle="1" w:styleId="Heading4Char">
@@ -1728,12 +2138,13 @@
     <w:semiHidden/>
     <w:rsid w:val="00FC693F"/>
     <w:rPr>
-      <w:rFonts w:asciiTheme="majorHAnsi" w:eastAsiaTheme="majorEastAsia" w:hAnsiTheme="majorHAnsi" w:cstheme="majorBidi"/>
+      <w:rFonts w:asciiTheme="majorHAnsi" w:eastAsiaTheme="majorEastAsia" w:hAnsiTheme="majorHAnsi" w:cstheme="majorBidi" w:ascii="Times New Roman" w:hAnsi="Times New Roman"/>
       <w:b/>
       <w:bCs/>
       <w:i/>
       <w:iCs/>
-      <w:color w:val="4F81BD" w:themeColor="accent1"/>
+      <w:color w:val="000000"/>
+      <w:sz w:val="24"/>
     </w:rPr>
   </w:style>
   <w:style w:type="character" w:customStyle="1" w:styleId="Heading5Char">
@@ -1744,8 +2155,9 @@
     <w:semiHidden/>
     <w:rsid w:val="00FC693F"/>
     <w:rPr>
-      <w:rFonts w:asciiTheme="majorHAnsi" w:eastAsiaTheme="majorEastAsia" w:hAnsiTheme="majorHAnsi" w:cstheme="majorBidi"/>
-      <w:color w:val="243F60" w:themeColor="accent1" w:themeShade="7F"/>
+      <w:rFonts w:asciiTheme="majorHAnsi" w:eastAsiaTheme="majorEastAsia" w:hAnsiTheme="majorHAnsi" w:cstheme="majorBidi" w:ascii="Times New Roman" w:hAnsi="Times New Roman"/>
+      <w:color w:val="000000"/>
+      <w:sz w:val="24"/>
     </w:rPr>
   </w:style>
   <w:style w:type="character" w:customStyle="1" w:styleId="Heading6Char">
@@ -1756,10 +2168,11 @@
     <w:semiHidden/>
     <w:rsid w:val="00FC693F"/>
     <w:rPr>
-      <w:rFonts w:asciiTheme="majorHAnsi" w:eastAsiaTheme="majorEastAsia" w:hAnsiTheme="majorHAnsi" w:cstheme="majorBidi"/>
+      <w:rFonts w:asciiTheme="majorHAnsi" w:eastAsiaTheme="majorEastAsia" w:hAnsiTheme="majorHAnsi" w:cstheme="majorBidi" w:ascii="Times New Roman" w:hAnsi="Times New Roman"/>
       <w:i/>
       <w:iCs/>
-      <w:color w:val="243F60" w:themeColor="accent1" w:themeShade="7F"/>
+      <w:color w:val="000000"/>
+      <w:sz w:val="24"/>
     </w:rPr>
   </w:style>
   <w:style w:type="character" w:customStyle="1" w:styleId="Heading7Char">
@@ -1770,10 +2183,11 @@
     <w:semiHidden/>
     <w:rsid w:val="00FC693F"/>
     <w:rPr>
-      <w:rFonts w:asciiTheme="majorHAnsi" w:eastAsiaTheme="majorEastAsia" w:hAnsiTheme="majorHAnsi" w:cstheme="majorBidi"/>
+      <w:rFonts w:asciiTheme="majorHAnsi" w:eastAsiaTheme="majorEastAsia" w:hAnsiTheme="majorHAnsi" w:cstheme="majorBidi" w:ascii="Times New Roman" w:hAnsi="Times New Roman"/>
       <w:i/>
       <w:iCs/>
-      <w:color w:val="404040" w:themeColor="text1" w:themeTint="BF"/>
+      <w:color w:val="000000"/>
+      <w:sz w:val="24"/>
     </w:rPr>
   </w:style>
   <w:style w:type="character" w:customStyle="1" w:styleId="Heading8Char">
@@ -1784,9 +2198,9 @@
     <w:semiHidden/>
     <w:rsid w:val="00FC693F"/>
     <w:rPr>
-      <w:rFonts w:asciiTheme="majorHAnsi" w:eastAsiaTheme="majorEastAsia" w:hAnsiTheme="majorHAnsi" w:cstheme="majorBidi"/>
-      <w:color w:val="4F81BD" w:themeColor="accent1"/>
-      <w:sz w:val="20"/>
+      <w:rFonts w:asciiTheme="majorHAnsi" w:eastAsiaTheme="majorEastAsia" w:hAnsiTheme="majorHAnsi" w:cstheme="majorBidi" w:ascii="Times New Roman" w:hAnsi="Times New Roman"/>
+      <w:color w:val="000000"/>
+      <w:sz w:val="24"/>
       <w:szCs w:val="20"/>
     </w:rPr>
   </w:style>
@@ -1798,11 +2212,11 @@
     <w:semiHidden/>
     <w:rsid w:val="00FC693F"/>
     <w:rPr>
-      <w:rFonts w:asciiTheme="majorHAnsi" w:eastAsiaTheme="majorEastAsia" w:hAnsiTheme="majorHAnsi" w:cstheme="majorBidi"/>
+      <w:rFonts w:asciiTheme="majorHAnsi" w:eastAsiaTheme="majorEastAsia" w:hAnsiTheme="majorHAnsi" w:cstheme="majorBidi" w:ascii="Times New Roman" w:hAnsi="Times New Roman"/>
       <w:i/>
       <w:iCs/>
-      <w:color w:val="404040" w:themeColor="text1" w:themeTint="BF"/>
-      <w:sz w:val="20"/>
+      <w:color w:val="000000"/>
+      <w:sz w:val="24"/>
       <w:szCs w:val="20"/>
     </w:rPr>
   </w:style>
@@ -1819,10 +2233,11 @@
       <w:spacing w:line="240" w:lineRule="auto"/>
     </w:pPr>
     <w:rPr>
+      <w:rFonts w:ascii="Times New Roman" w:hAnsi="Times New Roman"/>
       <w:b/>
       <w:bCs/>
-      <w:color w:val="4F81BD" w:themeColor="accent1"/>
-      <w:sz w:val="18"/>
+      <w:color w:val="000000"/>
+      <w:sz w:val="24"/>
       <w:szCs w:val="18"/>
     </w:rPr>
   </w:style>
@@ -1833,8 +2248,11 @@
     <w:qFormat/>
     <w:rsid w:val="00FC693F"/>
     <w:rPr>
+      <w:rFonts w:ascii="Times New Roman" w:hAnsi="Times New Roman"/>
       <w:b/>
       <w:bCs/>
+      <w:color w:val="000000"/>
+      <w:sz w:val="24"/>
     </w:rPr>
   </w:style>
   <w:style w:type="character" w:styleId="Emphasis">
@@ -1844,8 +2262,11 @@
     <w:qFormat/>
     <w:rsid w:val="00FC693F"/>
     <w:rPr>
+      <w:rFonts w:ascii="Times New Roman" w:hAnsi="Times New Roman"/>
       <w:i/>
       <w:iCs/>
+      <w:color w:val="000000"/>
+      <w:sz w:val="24"/>
     </w:rPr>
   </w:style>
   <w:style w:type="paragraph" w:styleId="IntenseQuote">
@@ -1864,11 +2285,13 @@
       <w:ind w:left="936" w:right="936"/>
     </w:pPr>
     <w:rPr>
+      <w:rFonts w:ascii="Times New Roman" w:hAnsi="Times New Roman"/>
       <w:b/>
       <w:bCs/>
       <w:i/>
       <w:iCs/>
-      <w:color w:val="4F81BD" w:themeColor="accent1"/>
+      <w:color w:val="000000"/>
+      <w:sz w:val="24"/>
     </w:rPr>
   </w:style>
   <w:style w:type="character" w:customStyle="1" w:styleId="IntenseQuoteChar">
@@ -1878,11 +2301,13 @@
     <w:uiPriority w:val="30"/>
     <w:rsid w:val="00FC693F"/>
     <w:rPr>
+      <w:rFonts w:ascii="Times New Roman" w:hAnsi="Times New Roman"/>
       <w:b/>
       <w:bCs/>
       <w:i/>
       <w:iCs/>
-      <w:color w:val="4F81BD" w:themeColor="accent1"/>
+      <w:color w:val="000000"/>
+      <w:sz w:val="24"/>
     </w:rPr>
   </w:style>
   <w:style w:type="character" w:styleId="SubtleEmphasis">
@@ -1892,9 +2317,11 @@
     <w:qFormat/>
     <w:rsid w:val="00FC693F"/>
     <w:rPr>
+      <w:rFonts w:ascii="Times New Roman" w:hAnsi="Times New Roman"/>
       <w:i/>
       <w:iCs/>
-      <w:color w:val="808080" w:themeColor="text1" w:themeTint="7F"/>
+      <w:color w:val="000000"/>
+      <w:sz w:val="24"/>
     </w:rPr>
   </w:style>
   <w:style w:type="character" w:styleId="IntenseEmphasis">
@@ -1904,11 +2331,13 @@
     <w:qFormat/>
     <w:rsid w:val="00FC693F"/>
     <w:rPr>
+      <w:rFonts w:ascii="Times New Roman" w:hAnsi="Times New Roman"/>
       <w:b/>
       <w:bCs/>
       <w:i/>
       <w:iCs/>
-      <w:color w:val="4F81BD" w:themeColor="accent1"/>
+      <w:color w:val="000000"/>
+      <w:sz w:val="24"/>
     </w:rPr>
   </w:style>
   <w:style w:type="character" w:styleId="SubtleReference">
@@ -1918,8 +2347,10 @@
     <w:qFormat/>
     <w:rsid w:val="00FC693F"/>
     <w:rPr>
+      <w:rFonts w:ascii="Times New Roman" w:hAnsi="Times New Roman"/>
       <w:smallCaps/>
-      <w:color w:val="C0504D" w:themeColor="accent2"/>
+      <w:color w:val="000000"/>
+      <w:sz w:val="24"/>
       <w:u w:val="single"/>
     </w:rPr>
   </w:style>
@@ -1930,11 +2361,13 @@
     <w:qFormat/>
     <w:rsid w:val="00FC693F"/>
     <w:rPr>
+      <w:rFonts w:ascii="Times New Roman" w:hAnsi="Times New Roman"/>
       <w:b/>
       <w:bCs/>
       <w:smallCaps/>
-      <w:color w:val="C0504D" w:themeColor="accent2"/>
+      <w:color w:val="000000"/>
       <w:spacing w:val="5"/>
+      <w:sz w:val="24"/>
       <w:u w:val="single"/>
     </w:rPr>
   </w:style>
@@ -1945,10 +2378,13 @@
     <w:qFormat/>
     <w:rsid w:val="00FC693F"/>
     <w:rPr>
+      <w:rFonts w:ascii="Times New Roman" w:hAnsi="Times New Roman"/>
       <w:b/>
       <w:bCs/>
       <w:smallCaps/>
+      <w:color w:val="000000"/>
       <w:spacing w:val="5"/>
+      <w:sz w:val="24"/>
     </w:rPr>
   </w:style>
   <w:style w:type="paragraph" w:styleId="TOCHeading">
@@ -1963,6 +2399,11 @@
     <w:pPr>
       <w:outlineLvl w:val="9"/>
     </w:pPr>
+    <w:rPr>
+      <w:rFonts w:ascii="Times New Roman" w:hAnsi="Times New Roman"/>
+      <w:color w:val="000000"/>
+      <w:sz w:val="24"/>
+    </w:rPr>
   </w:style>
   <w:style w:type="table" w:styleId="TableGrid">
     <w:name w:val="Table Grid"/>
@@ -1972,6 +2413,11 @@
     <w:pPr>
       <w:spacing w:after="0" w:line="240" w:lineRule="auto"/>
     </w:pPr>
+    <w:rPr>
+      <w:rFonts w:ascii="Times New Roman" w:hAnsi="Times New Roman"/>
+      <w:color w:val="000000"/>
+      <w:sz w:val="24"/>
+    </w:rPr>
     <w:tblPr>
       <w:tblInd w:w="0" w:type="dxa"/>
       <w:tblBorders>
@@ -1999,7 +2445,9 @@
       <w:spacing w:after="0" w:line="240" w:lineRule="auto"/>
     </w:pPr>
     <w:rPr>
-      <w:color w:val="000000" w:themeColor="text1" w:themeShade="BF"/>
+      <w:rFonts w:ascii="Times New Roman" w:hAnsi="Times New Roman"/>
+      <w:color w:val="000000"/>
+      <w:sz w:val="24"/>
     </w:rPr>
     <w:tblPr>
       <w:tblStyleRowBandSize w:val="1"/>
@@ -2102,7 +2550,9 @@
       <w:spacing w:after="0" w:line="240" w:lineRule="auto"/>
     </w:pPr>
     <w:rPr>
-      <w:color w:val="365F91" w:themeColor="accent1" w:themeShade="BF"/>
+      <w:rFonts w:ascii="Times New Roman" w:hAnsi="Times New Roman"/>
+      <w:color w:val="000000"/>
+      <w:sz w:val="24"/>
     </w:rPr>
     <w:tblPr>
       <w:tblStyleRowBandSize w:val="1"/>
@@ -2205,7 +2655,9 @@
       <w:spacing w:after="0" w:line="240" w:lineRule="auto"/>
     </w:pPr>
     <w:rPr>
-      <w:color w:val="943634" w:themeColor="accent2" w:themeShade="BF"/>
+      <w:rFonts w:ascii="Times New Roman" w:hAnsi="Times New Roman"/>
+      <w:color w:val="000000"/>
+      <w:sz w:val="24"/>
     </w:rPr>
     <w:tblPr>
       <w:tblStyleRowBandSize w:val="1"/>
@@ -2308,7 +2760,9 @@
       <w:spacing w:after="0" w:line="240" w:lineRule="auto"/>
     </w:pPr>
     <w:rPr>
-      <w:color w:val="76923C" w:themeColor="accent3" w:themeShade="BF"/>
+      <w:rFonts w:ascii="Times New Roman" w:hAnsi="Times New Roman"/>
+      <w:color w:val="000000"/>
+      <w:sz w:val="24"/>
     </w:rPr>
     <w:tblPr>
       <w:tblStyleRowBandSize w:val="1"/>
@@ -2411,7 +2865,9 @@
       <w:spacing w:after="0" w:line="240" w:lineRule="auto"/>
     </w:pPr>
     <w:rPr>
-      <w:color w:val="5F497A" w:themeColor="accent4" w:themeShade="BF"/>
+      <w:rFonts w:ascii="Times New Roman" w:hAnsi="Times New Roman"/>
+      <w:color w:val="000000"/>
+      <w:sz w:val="24"/>
     </w:rPr>
     <w:tblPr>
       <w:tblStyleRowBandSize w:val="1"/>
@@ -2514,7 +2970,9 @@
       <w:spacing w:after="0" w:line="240" w:lineRule="auto"/>
     </w:pPr>
     <w:rPr>
-      <w:color w:val="31849B" w:themeColor="accent5" w:themeShade="BF"/>
+      <w:rFonts w:ascii="Times New Roman" w:hAnsi="Times New Roman"/>
+      <w:color w:val="000000"/>
+      <w:sz w:val="24"/>
     </w:rPr>
     <w:tblPr>
       <w:tblStyleRowBandSize w:val="1"/>
@@ -2617,7 +3075,9 @@
       <w:spacing w:after="0" w:line="240" w:lineRule="auto"/>
     </w:pPr>
     <w:rPr>
-      <w:color w:val="E36C0A" w:themeColor="accent6" w:themeShade="BF"/>
+      <w:rFonts w:ascii="Times New Roman" w:hAnsi="Times New Roman"/>
+      <w:color w:val="000000"/>
+      <w:sz w:val="24"/>
     </w:rPr>
     <w:tblPr>
       <w:tblStyleRowBandSize w:val="1"/>
@@ -2719,6 +3179,11 @@
     <w:pPr>
       <w:spacing w:after="0" w:line="240" w:lineRule="auto"/>
     </w:pPr>
+    <w:rPr>
+      <w:rFonts w:ascii="Times New Roman" w:hAnsi="Times New Roman"/>
+      <w:color w:val="000000"/>
+      <w:sz w:val="24"/>
+    </w:rPr>
     <w:tblPr>
       <w:tblStyleRowBandSize w:val="1"/>
       <w:tblStyleColBandSize w:val="1"/>
@@ -2811,6 +3276,11 @@
     <w:pPr>
       <w:spacing w:after="0" w:line="240" w:lineRule="auto"/>
     </w:pPr>
+    <w:rPr>
+      <w:rFonts w:ascii="Times New Roman" w:hAnsi="Times New Roman"/>
+      <w:color w:val="000000"/>
+      <w:sz w:val="24"/>
+    </w:rPr>
     <w:tblPr>
       <w:tblStyleRowBandSize w:val="1"/>
       <w:tblStyleColBandSize w:val="1"/>
@@ -2903,6 +3373,11 @@
     <w:pPr>
       <w:spacing w:after="0" w:line="240" w:lineRule="auto"/>
     </w:pPr>
+    <w:rPr>
+      <w:rFonts w:ascii="Times New Roman" w:hAnsi="Times New Roman"/>
+      <w:color w:val="000000"/>
+      <w:sz w:val="24"/>
+    </w:rPr>
     <w:tblPr>
       <w:tblStyleRowBandSize w:val="1"/>
       <w:tblStyleColBandSize w:val="1"/>
@@ -2995,6 +3470,11 @@
     <w:pPr>
       <w:spacing w:after="0" w:line="240" w:lineRule="auto"/>
     </w:pPr>
+    <w:rPr>
+      <w:rFonts w:ascii="Times New Roman" w:hAnsi="Times New Roman"/>
+      <w:color w:val="000000"/>
+      <w:sz w:val="24"/>
+    </w:rPr>
     <w:tblPr>
       <w:tblStyleRowBandSize w:val="1"/>
       <w:tblStyleColBandSize w:val="1"/>
@@ -3087,6 +3567,11 @@
     <w:pPr>
       <w:spacing w:after="0" w:line="240" w:lineRule="auto"/>
     </w:pPr>
+    <w:rPr>
+      <w:rFonts w:ascii="Times New Roman" w:hAnsi="Times New Roman"/>
+      <w:color w:val="000000"/>
+      <w:sz w:val="24"/>
+    </w:rPr>
     <w:tblPr>
       <w:tblStyleRowBandSize w:val="1"/>
       <w:tblStyleColBandSize w:val="1"/>
@@ -3179,6 +3664,11 @@
     <w:pPr>
       <w:spacing w:after="0" w:line="240" w:lineRule="auto"/>
     </w:pPr>
+    <w:rPr>
+      <w:rFonts w:ascii="Times New Roman" w:hAnsi="Times New Roman"/>
+      <w:color w:val="000000"/>
+      <w:sz w:val="24"/>
+    </w:rPr>
     <w:tblPr>
       <w:tblStyleRowBandSize w:val="1"/>
       <w:tblStyleColBandSize w:val="1"/>
@@ -3271,6 +3761,11 @@
     <w:pPr>
       <w:spacing w:after="0" w:line="240" w:lineRule="auto"/>
     </w:pPr>
+    <w:rPr>
+      <w:rFonts w:ascii="Times New Roman" w:hAnsi="Times New Roman"/>
+      <w:color w:val="000000"/>
+      <w:sz w:val="24"/>
+    </w:rPr>
     <w:tblPr>
       <w:tblStyleRowBandSize w:val="1"/>
       <w:tblStyleColBandSize w:val="1"/>
@@ -3363,6 +3858,11 @@
     <w:pPr>
       <w:spacing w:after="0" w:line="240" w:lineRule="auto"/>
     </w:pPr>
+    <w:rPr>
+      <w:rFonts w:ascii="Times New Roman" w:hAnsi="Times New Roman"/>
+      <w:color w:val="000000"/>
+      <w:sz w:val="24"/>
+    </w:rPr>
     <w:tblPr>
       <w:tblStyleRowBandSize w:val="1"/>
       <w:tblStyleColBandSize w:val="1"/>
@@ -3493,6 +3993,11 @@
     <w:pPr>
       <w:spacing w:after="0" w:line="240" w:lineRule="auto"/>
     </w:pPr>
+    <w:rPr>
+      <w:rFonts w:ascii="Times New Roman" w:hAnsi="Times New Roman"/>
+      <w:color w:val="000000"/>
+      <w:sz w:val="24"/>
+    </w:rPr>
     <w:tblPr>
       <w:tblStyleRowBandSize w:val="1"/>
       <w:tblStyleColBandSize w:val="1"/>
@@ -3623,6 +4128,11 @@
     <w:pPr>
       <w:spacing w:after="0" w:line="240" w:lineRule="auto"/>
     </w:pPr>
+    <w:rPr>
+      <w:rFonts w:ascii="Times New Roman" w:hAnsi="Times New Roman"/>
+      <w:color w:val="000000"/>
+      <w:sz w:val="24"/>
+    </w:rPr>
     <w:tblPr>
       <w:tblStyleRowBandSize w:val="1"/>
       <w:tblStyleColBandSize w:val="1"/>
@@ -3753,6 +4263,11 @@
     <w:pPr>
       <w:spacing w:after="0" w:line="240" w:lineRule="auto"/>
     </w:pPr>
+    <w:rPr>
+      <w:rFonts w:ascii="Times New Roman" w:hAnsi="Times New Roman"/>
+      <w:color w:val="000000"/>
+      <w:sz w:val="24"/>
+    </w:rPr>
     <w:tblPr>
       <w:tblStyleRowBandSize w:val="1"/>
       <w:tblStyleColBandSize w:val="1"/>
@@ -3883,6 +4398,11 @@
     <w:pPr>
       <w:spacing w:after="0" w:line="240" w:lineRule="auto"/>
     </w:pPr>
+    <w:rPr>
+      <w:rFonts w:ascii="Times New Roman" w:hAnsi="Times New Roman"/>
+      <w:color w:val="000000"/>
+      <w:sz w:val="24"/>
+    </w:rPr>
     <w:tblPr>
       <w:tblStyleRowBandSize w:val="1"/>
       <w:tblStyleColBandSize w:val="1"/>
@@ -4013,6 +4533,11 @@
     <w:pPr>
       <w:spacing w:after="0" w:line="240" w:lineRule="auto"/>
     </w:pPr>
+    <w:rPr>
+      <w:rFonts w:ascii="Times New Roman" w:hAnsi="Times New Roman"/>
+      <w:color w:val="000000"/>
+      <w:sz w:val="24"/>
+    </w:rPr>
     <w:tblPr>
       <w:tblStyleRowBandSize w:val="1"/>
       <w:tblStyleColBandSize w:val="1"/>
@@ -4143,6 +4668,11 @@
     <w:pPr>
       <w:spacing w:after="0" w:line="240" w:lineRule="auto"/>
     </w:pPr>
+    <w:rPr>
+      <w:rFonts w:ascii="Times New Roman" w:hAnsi="Times New Roman"/>
+      <w:color w:val="000000"/>
+      <w:sz w:val="24"/>
+    </w:rPr>
     <w:tblPr>
       <w:tblStyleRowBandSize w:val="1"/>
       <w:tblStyleColBandSize w:val="1"/>
@@ -4273,6 +4803,11 @@
     <w:pPr>
       <w:spacing w:after="0" w:line="240" w:lineRule="auto"/>
     </w:pPr>
+    <w:rPr>
+      <w:rFonts w:ascii="Times New Roman" w:hAnsi="Times New Roman"/>
+      <w:color w:val="000000"/>
+      <w:sz w:val="24"/>
+    </w:rPr>
     <w:tblPr>
       <w:tblStyleRowBandSize w:val="1"/>
       <w:tblStyleColBandSize w:val="1"/>
@@ -4379,6 +4914,11 @@
     <w:pPr>
       <w:spacing w:after="0" w:line="240" w:lineRule="auto"/>
     </w:pPr>
+    <w:rPr>
+      <w:rFonts w:ascii="Times New Roman" w:hAnsi="Times New Roman"/>
+      <w:color w:val="000000"/>
+      <w:sz w:val="24"/>
+    </w:rPr>
     <w:tblPr>
       <w:tblStyleRowBandSize w:val="1"/>
       <w:tblStyleColBandSize w:val="1"/>
@@ -4485,6 +5025,11 @@
     <w:pPr>
       <w:spacing w:after="0" w:line="240" w:lineRule="auto"/>
     </w:pPr>
+    <w:rPr>
+      <w:rFonts w:ascii="Times New Roman" w:hAnsi="Times New Roman"/>
+      <w:color w:val="000000"/>
+      <w:sz w:val="24"/>
+    </w:rPr>
     <w:tblPr>
       <w:tblStyleRowBandSize w:val="1"/>
       <w:tblStyleColBandSize w:val="1"/>
@@ -4591,6 +5136,11 @@
     <w:pPr>
       <w:spacing w:after="0" w:line="240" w:lineRule="auto"/>
     </w:pPr>
+    <w:rPr>
+      <w:rFonts w:ascii="Times New Roman" w:hAnsi="Times New Roman"/>
+      <w:color w:val="000000"/>
+      <w:sz w:val="24"/>
+    </w:rPr>
     <w:tblPr>
       <w:tblStyleRowBandSize w:val="1"/>
       <w:tblStyleColBandSize w:val="1"/>
@@ -4697,6 +5247,11 @@
     <w:pPr>
       <w:spacing w:after="0" w:line="240" w:lineRule="auto"/>
     </w:pPr>
+    <w:rPr>
+      <w:rFonts w:ascii="Times New Roman" w:hAnsi="Times New Roman"/>
+      <w:color w:val="000000"/>
+      <w:sz w:val="24"/>
+    </w:rPr>
     <w:tblPr>
       <w:tblStyleRowBandSize w:val="1"/>
       <w:tblStyleColBandSize w:val="1"/>
@@ -4803,6 +5358,11 @@
     <w:pPr>
       <w:spacing w:after="0" w:line="240" w:lineRule="auto"/>
     </w:pPr>
+    <w:rPr>
+      <w:rFonts w:ascii="Times New Roman" w:hAnsi="Times New Roman"/>
+      <w:color w:val="000000"/>
+      <w:sz w:val="24"/>
+    </w:rPr>
     <w:tblPr>
       <w:tblStyleRowBandSize w:val="1"/>
       <w:tblStyleColBandSize w:val="1"/>
@@ -4909,6 +5469,11 @@
     <w:pPr>
       <w:spacing w:after="0" w:line="240" w:lineRule="auto"/>
     </w:pPr>
+    <w:rPr>
+      <w:rFonts w:ascii="Times New Roman" w:hAnsi="Times New Roman"/>
+      <w:color w:val="000000"/>
+      <w:sz w:val="24"/>
+    </w:rPr>
     <w:tblPr>
       <w:tblStyleRowBandSize w:val="1"/>
       <w:tblStyleColBandSize w:val="1"/>
@@ -5015,6 +5580,11 @@
     <w:pPr>
       <w:spacing w:after="0" w:line="240" w:lineRule="auto"/>
     </w:pPr>
+    <w:rPr>
+      <w:rFonts w:ascii="Times New Roman" w:hAnsi="Times New Roman"/>
+      <w:color w:val="000000"/>
+      <w:sz w:val="24"/>
+    </w:rPr>
     <w:tblPr>
       <w:tblStyleRowBandSize w:val="1"/>
       <w:tblStyleColBandSize w:val="1"/>
@@ -5164,6 +5734,11 @@
     <w:pPr>
       <w:spacing w:after="0" w:line="240" w:lineRule="auto"/>
     </w:pPr>
+    <w:rPr>
+      <w:rFonts w:ascii="Times New Roman" w:hAnsi="Times New Roman"/>
+      <w:color w:val="000000"/>
+      <w:sz w:val="24"/>
+    </w:rPr>
     <w:tblPr>
       <w:tblStyleRowBandSize w:val="1"/>
       <w:tblStyleColBandSize w:val="1"/>
@@ -5313,6 +5888,11 @@
     <w:pPr>
       <w:spacing w:after="0" w:line="240" w:lineRule="auto"/>
     </w:pPr>
+    <w:rPr>
+      <w:rFonts w:ascii="Times New Roman" w:hAnsi="Times New Roman"/>
+      <w:color w:val="000000"/>
+      <w:sz w:val="24"/>
+    </w:rPr>
     <w:tblPr>
       <w:tblStyleRowBandSize w:val="1"/>
       <w:tblStyleColBandSize w:val="1"/>
@@ -5462,6 +6042,11 @@
     <w:pPr>
       <w:spacing w:after="0" w:line="240" w:lineRule="auto"/>
     </w:pPr>
+    <w:rPr>
+      <w:rFonts w:ascii="Times New Roman" w:hAnsi="Times New Roman"/>
+      <w:color w:val="000000"/>
+      <w:sz w:val="24"/>
+    </w:rPr>
     <w:tblPr>
       <w:tblStyleRowBandSize w:val="1"/>
       <w:tblStyleColBandSize w:val="1"/>
@@ -5611,6 +6196,11 @@
     <w:pPr>
       <w:spacing w:after="0" w:line="240" w:lineRule="auto"/>
     </w:pPr>
+    <w:rPr>
+      <w:rFonts w:ascii="Times New Roman" w:hAnsi="Times New Roman"/>
+      <w:color w:val="000000"/>
+      <w:sz w:val="24"/>
+    </w:rPr>
     <w:tblPr>
       <w:tblStyleRowBandSize w:val="1"/>
       <w:tblStyleColBandSize w:val="1"/>
@@ -5760,6 +6350,11 @@
     <w:pPr>
       <w:spacing w:after="0" w:line="240" w:lineRule="auto"/>
     </w:pPr>
+    <w:rPr>
+      <w:rFonts w:ascii="Times New Roman" w:hAnsi="Times New Roman"/>
+      <w:color w:val="000000"/>
+      <w:sz w:val="24"/>
+    </w:rPr>
     <w:tblPr>
       <w:tblStyleRowBandSize w:val="1"/>
       <w:tblStyleColBandSize w:val="1"/>
@@ -5909,6 +6504,11 @@
     <w:pPr>
       <w:spacing w:after="0" w:line="240" w:lineRule="auto"/>
     </w:pPr>
+    <w:rPr>
+      <w:rFonts w:ascii="Times New Roman" w:hAnsi="Times New Roman"/>
+      <w:color w:val="000000"/>
+      <w:sz w:val="24"/>
+    </w:rPr>
     <w:tblPr>
       <w:tblStyleRowBandSize w:val="1"/>
       <w:tblStyleColBandSize w:val="1"/>
@@ -6059,7 +6659,9 @@
       <w:spacing w:after="0" w:line="240" w:lineRule="auto"/>
     </w:pPr>
     <w:rPr>
-      <w:color w:val="000000" w:themeColor="text1"/>
+      <w:rFonts w:ascii="Times New Roman" w:hAnsi="Times New Roman"/>
+      <w:color w:val="000000"/>
+      <w:sz w:val="24"/>
     </w:rPr>
     <w:tblPr>
       <w:tblStyleRowBandSize w:val="1"/>
@@ -6143,7 +6745,9 @@
       <w:spacing w:after="0" w:line="240" w:lineRule="auto"/>
     </w:pPr>
     <w:rPr>
-      <w:color w:val="000000" w:themeColor="text1"/>
+      <w:rFonts w:ascii="Times New Roman" w:hAnsi="Times New Roman"/>
+      <w:color w:val="000000"/>
+      <w:sz w:val="24"/>
     </w:rPr>
     <w:tblPr>
       <w:tblStyleRowBandSize w:val="1"/>
@@ -6227,7 +6831,9 @@
       <w:spacing w:after="0" w:line="240" w:lineRule="auto"/>
     </w:pPr>
     <w:rPr>
-      <w:color w:val="000000" w:themeColor="text1"/>
+      <w:rFonts w:ascii="Times New Roman" w:hAnsi="Times New Roman"/>
+      <w:color w:val="000000"/>
+      <w:sz w:val="24"/>
     </w:rPr>
     <w:tblPr>
       <w:tblStyleRowBandSize w:val="1"/>
@@ -6311,7 +6917,9 @@
       <w:spacing w:after="0" w:line="240" w:lineRule="auto"/>
     </w:pPr>
     <w:rPr>
-      <w:color w:val="000000" w:themeColor="text1"/>
+      <w:rFonts w:ascii="Times New Roman" w:hAnsi="Times New Roman"/>
+      <w:color w:val="000000"/>
+      <w:sz w:val="24"/>
     </w:rPr>
     <w:tblPr>
       <w:tblStyleRowBandSize w:val="1"/>
@@ -6395,7 +7003,9 @@
       <w:spacing w:after="0" w:line="240" w:lineRule="auto"/>
     </w:pPr>
     <w:rPr>
-      <w:color w:val="000000" w:themeColor="text1"/>
+      <w:rFonts w:ascii="Times New Roman" w:hAnsi="Times New Roman"/>
+      <w:color w:val="000000"/>
+      <w:sz w:val="24"/>
     </w:rPr>
     <w:tblPr>
       <w:tblStyleRowBandSize w:val="1"/>
@@ -6479,7 +7089,9 @@
       <w:spacing w:after="0" w:line="240" w:lineRule="auto"/>
     </w:pPr>
     <w:rPr>
-      <w:color w:val="000000" w:themeColor="text1"/>
+      <w:rFonts w:ascii="Times New Roman" w:hAnsi="Times New Roman"/>
+      <w:color w:val="000000"/>
+      <w:sz w:val="24"/>
     </w:rPr>
     <w:tblPr>
       <w:tblStyleRowBandSize w:val="1"/>
@@ -6563,7 +7175,9 @@
       <w:spacing w:after="0" w:line="240" w:lineRule="auto"/>
     </w:pPr>
     <w:rPr>
-      <w:color w:val="000000" w:themeColor="text1"/>
+      <w:rFonts w:ascii="Times New Roman" w:hAnsi="Times New Roman"/>
+      <w:color w:val="000000"/>
+      <w:sz w:val="24"/>
     </w:rPr>
     <w:tblPr>
       <w:tblStyleRowBandSize w:val="1"/>
@@ -6647,8 +7261,9 @@
       <w:spacing w:after="0" w:line="240" w:lineRule="auto"/>
     </w:pPr>
     <w:rPr>
-      <w:rFonts w:asciiTheme="majorHAnsi" w:eastAsiaTheme="majorEastAsia" w:hAnsiTheme="majorHAnsi" w:cstheme="majorBidi"/>
-      <w:color w:val="000000" w:themeColor="text1"/>
+      <w:rFonts w:asciiTheme="majorHAnsi" w:eastAsiaTheme="majorEastAsia" w:hAnsiTheme="majorHAnsi" w:cstheme="majorBidi" w:ascii="Times New Roman" w:hAnsi="Times New Roman"/>
+      <w:color w:val="000000"/>
+      <w:sz w:val="24"/>
     </w:rPr>
     <w:tblPr>
       <w:tblStyleRowBandSize w:val="1"/>
@@ -6775,8 +7390,9 @@
       <w:spacing w:after="0" w:line="240" w:lineRule="auto"/>
     </w:pPr>
     <w:rPr>
-      <w:rFonts w:asciiTheme="majorHAnsi" w:eastAsiaTheme="majorEastAsia" w:hAnsiTheme="majorHAnsi" w:cstheme="majorBidi"/>
-      <w:color w:val="000000" w:themeColor="text1"/>
+      <w:rFonts w:asciiTheme="majorHAnsi" w:eastAsiaTheme="majorEastAsia" w:hAnsiTheme="majorHAnsi" w:cstheme="majorBidi" w:ascii="Times New Roman" w:hAnsi="Times New Roman"/>
+      <w:color w:val="000000"/>
+      <w:sz w:val="24"/>
     </w:rPr>
     <w:tblPr>
       <w:tblStyleRowBandSize w:val="1"/>
@@ -6903,8 +7519,9 @@
       <w:spacing w:after="0" w:line="240" w:lineRule="auto"/>
     </w:pPr>
     <w:rPr>
-      <w:rFonts w:asciiTheme="majorHAnsi" w:eastAsiaTheme="majorEastAsia" w:hAnsiTheme="majorHAnsi" w:cstheme="majorBidi"/>
-      <w:color w:val="000000" w:themeColor="text1"/>
+      <w:rFonts w:asciiTheme="majorHAnsi" w:eastAsiaTheme="majorEastAsia" w:hAnsiTheme="majorHAnsi" w:cstheme="majorBidi" w:ascii="Times New Roman" w:hAnsi="Times New Roman"/>
+      <w:color w:val="000000"/>
+      <w:sz w:val="24"/>
     </w:rPr>
     <w:tblPr>
       <w:tblStyleRowBandSize w:val="1"/>
@@ -7031,8 +7648,9 @@
       <w:spacing w:after="0" w:line="240" w:lineRule="auto"/>
     </w:pPr>
     <w:rPr>
-      <w:rFonts w:asciiTheme="majorHAnsi" w:eastAsiaTheme="majorEastAsia" w:hAnsiTheme="majorHAnsi" w:cstheme="majorBidi"/>
-      <w:color w:val="000000" w:themeColor="text1"/>
+      <w:rFonts w:asciiTheme="majorHAnsi" w:eastAsiaTheme="majorEastAsia" w:hAnsiTheme="majorHAnsi" w:cstheme="majorBidi" w:ascii="Times New Roman" w:hAnsi="Times New Roman"/>
+      <w:color w:val="000000"/>
+      <w:sz w:val="24"/>
     </w:rPr>
     <w:tblPr>
       <w:tblStyleRowBandSize w:val="1"/>
@@ -7159,8 +7777,9 @@
       <w:spacing w:after="0" w:line="240" w:lineRule="auto"/>
     </w:pPr>
     <w:rPr>
-      <w:rFonts w:asciiTheme="majorHAnsi" w:eastAsiaTheme="majorEastAsia" w:hAnsiTheme="majorHAnsi" w:cstheme="majorBidi"/>
-      <w:color w:val="000000" w:themeColor="text1"/>
+      <w:rFonts w:asciiTheme="majorHAnsi" w:eastAsiaTheme="majorEastAsia" w:hAnsiTheme="majorHAnsi" w:cstheme="majorBidi" w:ascii="Times New Roman" w:hAnsi="Times New Roman"/>
+      <w:color w:val="000000"/>
+      <w:sz w:val="24"/>
     </w:rPr>
     <w:tblPr>
       <w:tblStyleRowBandSize w:val="1"/>
@@ -7287,8 +7906,9 @@
       <w:spacing w:after="0" w:line="240" w:lineRule="auto"/>
     </w:pPr>
     <w:rPr>
-      <w:rFonts w:asciiTheme="majorHAnsi" w:eastAsiaTheme="majorEastAsia" w:hAnsiTheme="majorHAnsi" w:cstheme="majorBidi"/>
-      <w:color w:val="000000" w:themeColor="text1"/>
+      <w:rFonts w:asciiTheme="majorHAnsi" w:eastAsiaTheme="majorEastAsia" w:hAnsiTheme="majorHAnsi" w:cstheme="majorBidi" w:ascii="Times New Roman" w:hAnsi="Times New Roman"/>
+      <w:color w:val="000000"/>
+      <w:sz w:val="24"/>
     </w:rPr>
     <w:tblPr>
       <w:tblStyleRowBandSize w:val="1"/>
@@ -7415,8 +8035,9 @@
       <w:spacing w:after="0" w:line="240" w:lineRule="auto"/>
     </w:pPr>
     <w:rPr>
-      <w:rFonts w:asciiTheme="majorHAnsi" w:eastAsiaTheme="majorEastAsia" w:hAnsiTheme="majorHAnsi" w:cstheme="majorBidi"/>
-      <w:color w:val="000000" w:themeColor="text1"/>
+      <w:rFonts w:asciiTheme="majorHAnsi" w:eastAsiaTheme="majorEastAsia" w:hAnsiTheme="majorHAnsi" w:cstheme="majorBidi" w:ascii="Times New Roman" w:hAnsi="Times New Roman"/>
+      <w:color w:val="000000"/>
+      <w:sz w:val="24"/>
     </w:rPr>
     <w:tblPr>
       <w:tblStyleRowBandSize w:val="1"/>
@@ -7542,6 +8163,11 @@
     <w:pPr>
       <w:spacing w:after="0" w:line="240" w:lineRule="auto"/>
     </w:pPr>
+    <w:rPr>
+      <w:rFonts w:ascii="Times New Roman" w:hAnsi="Times New Roman"/>
+      <w:color w:val="000000"/>
+      <w:sz w:val="24"/>
+    </w:rPr>
     <w:tblPr>
       <w:tblStyleRowBandSize w:val="1"/>
       <w:tblStyleColBandSize w:val="1"/>
@@ -7615,6 +8241,11 @@
     <w:pPr>
       <w:spacing w:after="0" w:line="240" w:lineRule="auto"/>
     </w:pPr>
+    <w:rPr>
+      <w:rFonts w:ascii="Times New Roman" w:hAnsi="Times New Roman"/>
+      <w:color w:val="000000"/>
+      <w:sz w:val="24"/>
+    </w:rPr>
     <w:tblPr>
       <w:tblStyleRowBandSize w:val="1"/>
       <w:tblStyleColBandSize w:val="1"/>
@@ -7688,6 +8319,11 @@
     <w:pPr>
       <w:spacing w:after="0" w:line="240" w:lineRule="auto"/>
     </w:pPr>
+    <w:rPr>
+      <w:rFonts w:ascii="Times New Roman" w:hAnsi="Times New Roman"/>
+      <w:color w:val="000000"/>
+      <w:sz w:val="24"/>
+    </w:rPr>
     <w:tblPr>
       <w:tblStyleRowBandSize w:val="1"/>
       <w:tblStyleColBandSize w:val="1"/>
@@ -7761,6 +8397,11 @@
     <w:pPr>
       <w:spacing w:after="0" w:line="240" w:lineRule="auto"/>
     </w:pPr>
+    <w:rPr>
+      <w:rFonts w:ascii="Times New Roman" w:hAnsi="Times New Roman"/>
+      <w:color w:val="000000"/>
+      <w:sz w:val="24"/>
+    </w:rPr>
     <w:tblPr>
       <w:tblStyleRowBandSize w:val="1"/>
       <w:tblStyleColBandSize w:val="1"/>
@@ -7834,6 +8475,11 @@
     <w:pPr>
       <w:spacing w:after="0" w:line="240" w:lineRule="auto"/>
     </w:pPr>
+    <w:rPr>
+      <w:rFonts w:ascii="Times New Roman" w:hAnsi="Times New Roman"/>
+      <w:color w:val="000000"/>
+      <w:sz w:val="24"/>
+    </w:rPr>
     <w:tblPr>
       <w:tblStyleRowBandSize w:val="1"/>
       <w:tblStyleColBandSize w:val="1"/>
@@ -7907,6 +8553,11 @@
     <w:pPr>
       <w:spacing w:after="0" w:line="240" w:lineRule="auto"/>
     </w:pPr>
+    <w:rPr>
+      <w:rFonts w:ascii="Times New Roman" w:hAnsi="Times New Roman"/>
+      <w:color w:val="000000"/>
+      <w:sz w:val="24"/>
+    </w:rPr>
     <w:tblPr>
       <w:tblStyleRowBandSize w:val="1"/>
       <w:tblStyleColBandSize w:val="1"/>
@@ -7980,6 +8631,11 @@
     <w:pPr>
       <w:spacing w:after="0" w:line="240" w:lineRule="auto"/>
     </w:pPr>
+    <w:rPr>
+      <w:rFonts w:ascii="Times New Roman" w:hAnsi="Times New Roman"/>
+      <w:color w:val="000000"/>
+      <w:sz w:val="24"/>
+    </w:rPr>
     <w:tblPr>
       <w:tblStyleRowBandSize w:val="1"/>
       <w:tblStyleColBandSize w:val="1"/>
@@ -8054,8 +8710,9 @@
       <w:spacing w:after="0" w:line="240" w:lineRule="auto"/>
     </w:pPr>
     <w:rPr>
-      <w:rFonts w:asciiTheme="majorHAnsi" w:eastAsiaTheme="majorEastAsia" w:hAnsiTheme="majorHAnsi" w:cstheme="majorBidi"/>
-      <w:color w:val="000000" w:themeColor="text1"/>
+      <w:rFonts w:asciiTheme="majorHAnsi" w:eastAsiaTheme="majorEastAsia" w:hAnsiTheme="majorHAnsi" w:cstheme="majorBidi" w:ascii="Times New Roman" w:hAnsi="Times New Roman"/>
+      <w:color w:val="000000"/>
+      <w:sz w:val="24"/>
     </w:rPr>
     <w:tblPr>
       <w:tblStyleRowBandSize w:val="1"/>
@@ -8179,8 +8836,9 @@
       <w:spacing w:after="0" w:line="240" w:lineRule="auto"/>
     </w:pPr>
     <w:rPr>
-      <w:rFonts w:asciiTheme="majorHAnsi" w:eastAsiaTheme="majorEastAsia" w:hAnsiTheme="majorHAnsi" w:cstheme="majorBidi"/>
-      <w:color w:val="000000" w:themeColor="text1"/>
+      <w:rFonts w:asciiTheme="majorHAnsi" w:eastAsiaTheme="majorEastAsia" w:hAnsiTheme="majorHAnsi" w:cstheme="majorBidi" w:ascii="Times New Roman" w:hAnsi="Times New Roman"/>
+      <w:color w:val="000000"/>
+      <w:sz w:val="24"/>
     </w:rPr>
     <w:tblPr>
       <w:tblStyleRowBandSize w:val="1"/>
@@ -8304,8 +8962,9 @@
       <w:spacing w:after="0" w:line="240" w:lineRule="auto"/>
     </w:pPr>
     <w:rPr>
-      <w:rFonts w:asciiTheme="majorHAnsi" w:eastAsiaTheme="majorEastAsia" w:hAnsiTheme="majorHAnsi" w:cstheme="majorBidi"/>
-      <w:color w:val="000000" w:themeColor="text1"/>
+      <w:rFonts w:asciiTheme="majorHAnsi" w:eastAsiaTheme="majorEastAsia" w:hAnsiTheme="majorHAnsi" w:cstheme="majorBidi" w:ascii="Times New Roman" w:hAnsi="Times New Roman"/>
+      <w:color w:val="000000"/>
+      <w:sz w:val="24"/>
     </w:rPr>
     <w:tblPr>
       <w:tblStyleRowBandSize w:val="1"/>
@@ -8429,8 +9088,9 @@
       <w:spacing w:after="0" w:line="240" w:lineRule="auto"/>
     </w:pPr>
     <w:rPr>
-      <w:rFonts w:asciiTheme="majorHAnsi" w:eastAsiaTheme="majorEastAsia" w:hAnsiTheme="majorHAnsi" w:cstheme="majorBidi"/>
-      <w:color w:val="000000" w:themeColor="text1"/>
+      <w:rFonts w:asciiTheme="majorHAnsi" w:eastAsiaTheme="majorEastAsia" w:hAnsiTheme="majorHAnsi" w:cstheme="majorBidi" w:ascii="Times New Roman" w:hAnsi="Times New Roman"/>
+      <w:color w:val="000000"/>
+      <w:sz w:val="24"/>
     </w:rPr>
     <w:tblPr>
       <w:tblStyleRowBandSize w:val="1"/>
@@ -8554,8 +9214,9 @@
       <w:spacing w:after="0" w:line="240" w:lineRule="auto"/>
     </w:pPr>
     <w:rPr>
-      <w:rFonts w:asciiTheme="majorHAnsi" w:eastAsiaTheme="majorEastAsia" w:hAnsiTheme="majorHAnsi" w:cstheme="majorBidi"/>
-      <w:color w:val="000000" w:themeColor="text1"/>
+      <w:rFonts w:asciiTheme="majorHAnsi" w:eastAsiaTheme="majorEastAsia" w:hAnsiTheme="majorHAnsi" w:cstheme="majorBidi" w:ascii="Times New Roman" w:hAnsi="Times New Roman"/>
+      <w:color w:val="000000"/>
+      <w:sz w:val="24"/>
     </w:rPr>
     <w:tblPr>
       <w:tblStyleRowBandSize w:val="1"/>
@@ -8679,8 +9340,9 @@
       <w:spacing w:after="0" w:line="240" w:lineRule="auto"/>
     </w:pPr>
     <w:rPr>
-      <w:rFonts w:asciiTheme="majorHAnsi" w:eastAsiaTheme="majorEastAsia" w:hAnsiTheme="majorHAnsi" w:cstheme="majorBidi"/>
-      <w:color w:val="000000" w:themeColor="text1"/>
+      <w:rFonts w:asciiTheme="majorHAnsi" w:eastAsiaTheme="majorEastAsia" w:hAnsiTheme="majorHAnsi" w:cstheme="majorBidi" w:ascii="Times New Roman" w:hAnsi="Times New Roman"/>
+      <w:color w:val="000000"/>
+      <w:sz w:val="24"/>
     </w:rPr>
     <w:tblPr>
       <w:tblStyleRowBandSize w:val="1"/>
@@ -8804,8 +9466,9 @@
       <w:spacing w:after="0" w:line="240" w:lineRule="auto"/>
     </w:pPr>
     <w:rPr>
-      <w:rFonts w:asciiTheme="majorHAnsi" w:eastAsiaTheme="majorEastAsia" w:hAnsiTheme="majorHAnsi" w:cstheme="majorBidi"/>
-      <w:color w:val="000000" w:themeColor="text1"/>
+      <w:rFonts w:asciiTheme="majorHAnsi" w:eastAsiaTheme="majorEastAsia" w:hAnsiTheme="majorHAnsi" w:cstheme="majorBidi" w:ascii="Times New Roman" w:hAnsi="Times New Roman"/>
+      <w:color w:val="000000"/>
+      <w:sz w:val="24"/>
     </w:rPr>
     <w:tblPr>
       <w:tblStyleRowBandSize w:val="1"/>
@@ -8928,6 +9591,11 @@
     <w:pPr>
       <w:spacing w:after="0" w:line="240" w:lineRule="auto"/>
     </w:pPr>
+    <w:rPr>
+      <w:rFonts w:ascii="Times New Roman" w:hAnsi="Times New Roman"/>
+      <w:color w:val="000000"/>
+      <w:sz w:val="24"/>
+    </w:rPr>
     <w:tblPr>
       <w:tblStyleRowBandSize w:val="1"/>
       <w:tblStyleColBandSize w:val="1"/>
@@ -9069,6 +9737,11 @@
     <w:pPr>
       <w:spacing w:after="0" w:line="240" w:lineRule="auto"/>
     </w:pPr>
+    <w:rPr>
+      <w:rFonts w:ascii="Times New Roman" w:hAnsi="Times New Roman"/>
+      <w:color w:val="000000"/>
+      <w:sz w:val="24"/>
+    </w:rPr>
     <w:tblPr>
       <w:tblStyleRowBandSize w:val="1"/>
       <w:tblStyleColBandSize w:val="1"/>
@@ -9210,6 +9883,11 @@
     <w:pPr>
       <w:spacing w:after="0" w:line="240" w:lineRule="auto"/>
     </w:pPr>
+    <w:rPr>
+      <w:rFonts w:ascii="Times New Roman" w:hAnsi="Times New Roman"/>
+      <w:color w:val="000000"/>
+      <w:sz w:val="24"/>
+    </w:rPr>
     <w:tblPr>
       <w:tblStyleRowBandSize w:val="1"/>
       <w:tblStyleColBandSize w:val="1"/>
@@ -9351,6 +10029,11 @@
     <w:pPr>
       <w:spacing w:after="0" w:line="240" w:lineRule="auto"/>
     </w:pPr>
+    <w:rPr>
+      <w:rFonts w:ascii="Times New Roman" w:hAnsi="Times New Roman"/>
+      <w:color w:val="000000"/>
+      <w:sz w:val="24"/>
+    </w:rPr>
     <w:tblPr>
       <w:tblStyleRowBandSize w:val="1"/>
       <w:tblStyleColBandSize w:val="1"/>
@@ -9492,6 +10175,11 @@
     <w:pPr>
       <w:spacing w:after="0" w:line="240" w:lineRule="auto"/>
     </w:pPr>
+    <w:rPr>
+      <w:rFonts w:ascii="Times New Roman" w:hAnsi="Times New Roman"/>
+      <w:color w:val="000000"/>
+      <w:sz w:val="24"/>
+    </w:rPr>
     <w:tblPr>
       <w:tblStyleRowBandSize w:val="1"/>
       <w:tblStyleColBandSize w:val="1"/>
@@ -9633,6 +10321,11 @@
     <w:pPr>
       <w:spacing w:after="0" w:line="240" w:lineRule="auto"/>
     </w:pPr>
+    <w:rPr>
+      <w:rFonts w:ascii="Times New Roman" w:hAnsi="Times New Roman"/>
+      <w:color w:val="000000"/>
+      <w:sz w:val="24"/>
+    </w:rPr>
     <w:tblPr>
       <w:tblStyleRowBandSize w:val="1"/>
       <w:tblStyleColBandSize w:val="1"/>
@@ -9774,6 +10467,11 @@
     <w:pPr>
       <w:spacing w:after="0" w:line="240" w:lineRule="auto"/>
     </w:pPr>
+    <w:rPr>
+      <w:rFonts w:ascii="Times New Roman" w:hAnsi="Times New Roman"/>
+      <w:color w:val="000000"/>
+      <w:sz w:val="24"/>
+    </w:rPr>
     <w:tblPr>
       <w:tblStyleRowBandSize w:val="1"/>
       <w:tblStyleColBandSize w:val="1"/>
@@ -9916,7 +10614,9 @@
       <w:spacing w:after="0" w:line="240" w:lineRule="auto"/>
     </w:pPr>
     <w:rPr>
-      <w:color w:val="FFFFFF" w:themeColor="background1"/>
+      <w:rFonts w:ascii="Times New Roman" w:hAnsi="Times New Roman"/>
+      <w:color w:val="000000"/>
+      <w:sz w:val="24"/>
     </w:rPr>
     <w:tblPr>
       <w:tblStyleRowBandSize w:val="1"/>
@@ -10030,7 +10730,9 @@
       <w:spacing w:after="0" w:line="240" w:lineRule="auto"/>
     </w:pPr>
     <w:rPr>
-      <w:color w:val="FFFFFF" w:themeColor="background1"/>
+      <w:rFonts w:ascii="Times New Roman" w:hAnsi="Times New Roman"/>
+      <w:color w:val="000000"/>
+      <w:sz w:val="24"/>
     </w:rPr>
     <w:tblPr>
       <w:tblStyleRowBandSize w:val="1"/>
@@ -10144,7 +10846,9 @@
       <w:spacing w:after="0" w:line="240" w:lineRule="auto"/>
     </w:pPr>
     <w:rPr>
-      <w:color w:val="FFFFFF" w:themeColor="background1"/>
+      <w:rFonts w:ascii="Times New Roman" w:hAnsi="Times New Roman"/>
+      <w:color w:val="000000"/>
+      <w:sz w:val="24"/>
     </w:rPr>
     <w:tblPr>
       <w:tblStyleRowBandSize w:val="1"/>
@@ -10258,7 +10962,9 @@
       <w:spacing w:after="0" w:line="240" w:lineRule="auto"/>
     </w:pPr>
     <w:rPr>
-      <w:color w:val="FFFFFF" w:themeColor="background1"/>
+      <w:rFonts w:ascii="Times New Roman" w:hAnsi="Times New Roman"/>
+      <w:color w:val="000000"/>
+      <w:sz w:val="24"/>
     </w:rPr>
     <w:tblPr>
       <w:tblStyleRowBandSize w:val="1"/>
@@ -10372,7 +11078,9 @@
       <w:spacing w:after="0" w:line="240" w:lineRule="auto"/>
     </w:pPr>
     <w:rPr>
-      <w:color w:val="FFFFFF" w:themeColor="background1"/>
+      <w:rFonts w:ascii="Times New Roman" w:hAnsi="Times New Roman"/>
+      <w:color w:val="000000"/>
+      <w:sz w:val="24"/>
     </w:rPr>
     <w:tblPr>
       <w:tblStyleRowBandSize w:val="1"/>
@@ -10486,7 +11194,9 @@
       <w:spacing w:after="0" w:line="240" w:lineRule="auto"/>
     </w:pPr>
     <w:rPr>
-      <w:color w:val="FFFFFF" w:themeColor="background1"/>
+      <w:rFonts w:ascii="Times New Roman" w:hAnsi="Times New Roman"/>
+      <w:color w:val="000000"/>
+      <w:sz w:val="24"/>
     </w:rPr>
     <w:tblPr>
       <w:tblStyleRowBandSize w:val="1"/>
@@ -10600,7 +11310,9 @@
       <w:spacing w:after="0" w:line="240" w:lineRule="auto"/>
     </w:pPr>
     <w:rPr>
-      <w:color w:val="FFFFFF" w:themeColor="background1"/>
+      <w:rFonts w:ascii="Times New Roman" w:hAnsi="Times New Roman"/>
+      <w:color w:val="000000"/>
+      <w:sz w:val="24"/>
     </w:rPr>
     <w:tblPr>
       <w:tblStyleRowBandSize w:val="1"/>
@@ -10714,7 +11426,9 @@
       <w:spacing w:after="0" w:line="240" w:lineRule="auto"/>
     </w:pPr>
     <w:rPr>
-      <w:color w:val="000000" w:themeColor="text1"/>
+      <w:rFonts w:ascii="Times New Roman" w:hAnsi="Times New Roman"/>
+      <w:color w:val="000000"/>
+      <w:sz w:val="24"/>
     </w:rPr>
     <w:tblPr>
       <w:tblStyleRowBandSize w:val="1"/>
@@ -10836,7 +11550,9 @@
       <w:spacing w:after="0" w:line="240" w:lineRule="auto"/>
     </w:pPr>
     <w:rPr>
-      <w:color w:val="000000" w:themeColor="text1"/>
+      <w:rFonts w:ascii="Times New Roman" w:hAnsi="Times New Roman"/>
+      <w:color w:val="000000"/>
+      <w:sz w:val="24"/>
     </w:rPr>
     <w:tblPr>
       <w:tblStyleRowBandSize w:val="1"/>
@@ -10958,7 +11674,9 @@
       <w:spacing w:after="0" w:line="240" w:lineRule="auto"/>
     </w:pPr>
     <w:rPr>
-      <w:color w:val="000000" w:themeColor="text1"/>
+      <w:rFonts w:ascii="Times New Roman" w:hAnsi="Times New Roman"/>
+      <w:color w:val="000000"/>
+      <w:sz w:val="24"/>
     </w:rPr>
     <w:tblPr>
       <w:tblStyleRowBandSize w:val="1"/>
@@ -11080,7 +11798,9 @@
       <w:spacing w:after="0" w:line="240" w:lineRule="auto"/>
     </w:pPr>
     <w:rPr>
-      <w:color w:val="000000" w:themeColor="text1"/>
+      <w:rFonts w:ascii="Times New Roman" w:hAnsi="Times New Roman"/>
+      <w:color w:val="000000"/>
+      <w:sz w:val="24"/>
     </w:rPr>
     <w:tblPr>
       <w:tblStyleRowBandSize w:val="1"/>
@@ -11192,7 +11912,9 @@
       <w:spacing w:after="0" w:line="240" w:lineRule="auto"/>
     </w:pPr>
     <w:rPr>
-      <w:color w:val="000000" w:themeColor="text1"/>
+      <w:rFonts w:ascii="Times New Roman" w:hAnsi="Times New Roman"/>
+      <w:color w:val="000000"/>
+      <w:sz w:val="24"/>
     </w:rPr>
     <w:tblPr>
       <w:tblStyleRowBandSize w:val="1"/>
@@ -11314,7 +12036,9 @@
       <w:spacing w:after="0" w:line="240" w:lineRule="auto"/>
     </w:pPr>
     <w:rPr>
-      <w:color w:val="000000" w:themeColor="text1"/>
+      <w:rFonts w:ascii="Times New Roman" w:hAnsi="Times New Roman"/>
+      <w:color w:val="000000"/>
+      <w:sz w:val="24"/>
     </w:rPr>
     <w:tblPr>
       <w:tblStyleRowBandSize w:val="1"/>
@@ -11436,7 +12160,9 @@
       <w:spacing w:after="0" w:line="240" w:lineRule="auto"/>
     </w:pPr>
     <w:rPr>
-      <w:color w:val="000000" w:themeColor="text1"/>
+      <w:rFonts w:ascii="Times New Roman" w:hAnsi="Times New Roman"/>
+      <w:color w:val="000000"/>
+      <w:sz w:val="24"/>
     </w:rPr>
     <w:tblPr>
       <w:tblStyleRowBandSize w:val="1"/>
@@ -11558,7 +12284,9 @@
       <w:spacing w:after="0" w:line="240" w:lineRule="auto"/>
     </w:pPr>
     <w:rPr>
-      <w:color w:val="000000" w:themeColor="text1"/>
+      <w:rFonts w:ascii="Times New Roman" w:hAnsi="Times New Roman"/>
+      <w:color w:val="000000"/>
+      <w:sz w:val="24"/>
     </w:rPr>
     <w:tblPr>
       <w:tblStyleRowBandSize w:val="1"/>
@@ -11644,7 +12372,9 @@
       <w:spacing w:after="0" w:line="240" w:lineRule="auto"/>
     </w:pPr>
     <w:rPr>
-      <w:color w:val="000000" w:themeColor="text1"/>
+      <w:rFonts w:ascii="Times New Roman" w:hAnsi="Times New Roman"/>
+      <w:color w:val="000000"/>
+      <w:sz w:val="24"/>
     </w:rPr>
     <w:tblPr>
       <w:tblStyleRowBandSize w:val="1"/>
@@ -11730,7 +12460,9 @@
       <w:spacing w:after="0" w:line="240" w:lineRule="auto"/>
     </w:pPr>
     <w:rPr>
-      <w:color w:val="000000" w:themeColor="text1"/>
+      <w:rFonts w:ascii="Times New Roman" w:hAnsi="Times New Roman"/>
+      <w:color w:val="000000"/>
+      <w:sz w:val="24"/>
     </w:rPr>
     <w:tblPr>
       <w:tblStyleRowBandSize w:val="1"/>
@@ -11816,7 +12548,9 @@
       <w:spacing w:after="0" w:line="240" w:lineRule="auto"/>
     </w:pPr>
     <w:rPr>
-      <w:color w:val="000000" w:themeColor="text1"/>
+      <w:rFonts w:ascii="Times New Roman" w:hAnsi="Times New Roman"/>
+      <w:color w:val="000000"/>
+      <w:sz w:val="24"/>
     </w:rPr>
     <w:tblPr>
       <w:tblStyleRowBandSize w:val="1"/>
@@ -11902,7 +12636,9 @@
       <w:spacing w:after="0" w:line="240" w:lineRule="auto"/>
     </w:pPr>
     <w:rPr>
-      <w:color w:val="000000" w:themeColor="text1"/>
+      <w:rFonts w:ascii="Times New Roman" w:hAnsi="Times New Roman"/>
+      <w:color w:val="000000"/>
+      <w:sz w:val="24"/>
     </w:rPr>
     <w:tblPr>
       <w:tblStyleRowBandSize w:val="1"/>
@@ -11988,7 +12724,9 @@
       <w:spacing w:after="0" w:line="240" w:lineRule="auto"/>
     </w:pPr>
     <w:rPr>
-      <w:color w:val="000000" w:themeColor="text1"/>
+      <w:rFonts w:ascii="Times New Roman" w:hAnsi="Times New Roman"/>
+      <w:color w:val="000000"/>
+      <w:sz w:val="24"/>
     </w:rPr>
     <w:tblPr>
       <w:tblStyleRowBandSize w:val="1"/>
@@ -12074,7 +12812,9 @@
       <w:spacing w:after="0" w:line="240" w:lineRule="auto"/>
     </w:pPr>
     <w:rPr>
-      <w:color w:val="000000" w:themeColor="text1"/>
+      <w:rFonts w:ascii="Times New Roman" w:hAnsi="Times New Roman"/>
+      <w:color w:val="000000"/>
+      <w:sz w:val="24"/>
     </w:rPr>
     <w:tblPr>
       <w:tblStyleRowBandSize w:val="1"/>
@@ -12160,7 +12900,9 @@
       <w:spacing w:after="0" w:line="240" w:lineRule="auto"/>
     </w:pPr>
     <w:rPr>
-      <w:color w:val="000000" w:themeColor="text1"/>
+      <w:rFonts w:ascii="Times New Roman" w:hAnsi="Times New Roman"/>
+      <w:color w:val="000000"/>
+      <w:sz w:val="24"/>
     </w:rPr>
     <w:tblPr>
       <w:tblStyleRowBandSize w:val="1"/>
@@ -12240,7 +12982,9 @@
       <w:spacing w:after="0" w:line="240" w:lineRule="auto"/>
     </w:pPr>
     <w:rPr>
-      <w:color w:val="000000" w:themeColor="text1"/>
+      <w:rFonts w:ascii="Times New Roman" w:hAnsi="Times New Roman"/>
+      <w:color w:val="000000"/>
+      <w:sz w:val="24"/>
     </w:rPr>
     <w:tblPr>
       <w:tblStyleRowBandSize w:val="1"/>
@@ -12320,7 +13064,9 @@
       <w:spacing w:after="0" w:line="240" w:lineRule="auto"/>
     </w:pPr>
     <w:rPr>
-      <w:color w:val="000000" w:themeColor="text1"/>
+      <w:rFonts w:ascii="Times New Roman" w:hAnsi="Times New Roman"/>
+      <w:color w:val="000000"/>
+      <w:sz w:val="24"/>
     </w:rPr>
     <w:tblPr>
       <w:tblStyleRowBandSize w:val="1"/>
@@ -12400,7 +13146,9 @@
       <w:spacing w:after="0" w:line="240" w:lineRule="auto"/>
     </w:pPr>
     <w:rPr>
-      <w:color w:val="000000" w:themeColor="text1"/>
+      <w:rFonts w:ascii="Times New Roman" w:hAnsi="Times New Roman"/>
+      <w:color w:val="000000"/>
+      <w:sz w:val="24"/>
     </w:rPr>
     <w:tblPr>
       <w:tblStyleRowBandSize w:val="1"/>
@@ -12480,7 +13228,9 @@
       <w:spacing w:after="0" w:line="240" w:lineRule="auto"/>
     </w:pPr>
     <w:rPr>
-      <w:color w:val="000000" w:themeColor="text1"/>
+      <w:rFonts w:ascii="Times New Roman" w:hAnsi="Times New Roman"/>
+      <w:color w:val="000000"/>
+      <w:sz w:val="24"/>
     </w:rPr>
     <w:tblPr>
       <w:tblStyleRowBandSize w:val="1"/>
@@ -12560,7 +13310,9 @@
       <w:spacing w:after="0" w:line="240" w:lineRule="auto"/>
     </w:pPr>
     <w:rPr>
-      <w:color w:val="000000" w:themeColor="text1"/>
+      <w:rFonts w:ascii="Times New Roman" w:hAnsi="Times New Roman"/>
+      <w:color w:val="000000"/>
+      <w:sz w:val="24"/>
     </w:rPr>
     <w:tblPr>
       <w:tblStyleRowBandSize w:val="1"/>
@@ -12640,7 +13392,9 @@
       <w:spacing w:after="0" w:line="240" w:lineRule="auto"/>
     </w:pPr>
     <w:rPr>
-      <w:color w:val="000000" w:themeColor="text1"/>
+      <w:rFonts w:ascii="Times New Roman" w:hAnsi="Times New Roman"/>
+      <w:color w:val="000000"/>
+      <w:sz w:val="24"/>
     </w:rPr>
     <w:tblPr>
       <w:tblStyleRowBandSize w:val="1"/>

</xml_diff>